<commit_message>
fix loi chinh ta
</commit_message>
<xml_diff>
--- a/doc/02-NguyenMinhThuan.docx
+++ b/doc/02-NguyenMinhThuan.docx
@@ -113,16 +113,26 @@
           <w:sz w:val="26"/>
           <w:szCs w:val="26"/>
         </w:rPr>
-        <w:t>- Thành viên nhóm</w:t>
-      </w:r>
+        <w:t xml:space="preserve">- Thành viên </w:t>
+      </w:r>
+      <w:proofErr w:type="gramStart"/>
       <w:r>
         <w:rPr>
           <w:rFonts w:ascii="Times New Roman" w:hAnsi="Times New Roman" w:cs="Times New Roman"/>
           <w:sz w:val="26"/>
           <w:szCs w:val="26"/>
         </w:rPr>
+        <w:t>nhóm</w:t>
+      </w:r>
+      <w:r>
+        <w:rPr>
+          <w:rFonts w:ascii="Times New Roman" w:hAnsi="Times New Roman" w:cs="Times New Roman"/>
+          <w:sz w:val="26"/>
+          <w:szCs w:val="26"/>
+        </w:rPr>
         <w:t xml:space="preserve"> :</w:t>
       </w:r>
+      <w:proofErr w:type="gramEnd"/>
     </w:p>
     <w:p>
       <w:pPr>
@@ -1048,15 +1058,7 @@
           <w:sz w:val="26"/>
           <w:szCs w:val="26"/>
         </w:rPr>
-        <w:t xml:space="preserve"> bằng cách xem lại lịch sử điều trị, kiểm tra tình trạng hiện tại và ghi nhận kết quả. Dựa trên kết quả tái khám, bác sĩ có thể xác định tình trạng đã ổn định, tiếp tục kế hoạch điều trị, điều chỉnh kế hoạch </w:t>
-      </w:r>
-      <w:r>
-        <w:rPr>
-          <w:sz w:val="26"/>
-          <w:szCs w:val="26"/>
-        </w:rPr>
-        <w:lastRenderedPageBreak/>
-        <w:t>hoặc thực hiện thêm dịch vụ. Kết quả tái khám được lưu vào hồ sơ và là cơ sở cho các buổi điều trị hoặc lịch tái khám tiếp theo.</w:t>
+        <w:t xml:space="preserve"> bằng cách xem lại lịch sử điều trị, kiểm tra tình trạng hiện tại và ghi nhận kết quả. Dựa trên kết quả tái khám, bác sĩ có thể xác định tình trạng đã ổn định, tiếp tục kế hoạch điều trị, điều chỉnh kế hoạch hoặc thực hiện thêm dịch vụ. Kết quả tái khám được lưu vào hồ sơ và là cơ sở cho các buổi điều trị hoặc lịch tái khám tiếp theo.</w:t>
       </w:r>
     </w:p>
     <w:p>
@@ -1074,6 +1076,7 @@
           <w:sz w:val="26"/>
           <w:szCs w:val="26"/>
         </w:rPr>
+        <w:lastRenderedPageBreak/>
         <w:t xml:space="preserve">Khi toàn bộ dịch vụ trong kế hoạch đã hoàn thành và bác sĩ xác nhận kết quả đạt yêu cầu, phòng khám thực hiện </w:t>
       </w:r>
       <w:r>
@@ -1363,7 +1366,6 @@
           <w:sz w:val="26"/>
           <w:szCs w:val="26"/>
         </w:rPr>
-        <w:lastRenderedPageBreak/>
         <w:t>Dựa trên tình trạng thực tế, bác sĩ xác định phương án điều trị phù hợp. Một bệnh nhân có thể có nhiều vấn đề răng miệng và cần thực hiện nhiều dịch vụ khác nhau.</w:t>
       </w:r>
     </w:p>
@@ -1385,6 +1387,7 @@
           <w:sz w:val="26"/>
           <w:szCs w:val="26"/>
         </w:rPr>
+        <w:lastRenderedPageBreak/>
         <w:t>Bước 4: Tư vấn cho bệnh nhân</w:t>
       </w:r>
     </w:p>
@@ -1731,8 +1734,43 @@
           <w:sz w:val="26"/>
           <w:szCs w:val="26"/>
         </w:rPr>
+        <w:t>Bước 1: Bệnh nhân đến phòng khám</w:t>
+      </w:r>
+    </w:p>
+    <w:p>
+      <w:pPr>
+        <w:pStyle w:val="NormalWeb"/>
+        <w:ind w:left="360" w:firstLine="360"/>
+        <w:rPr>
+          <w:sz w:val="26"/>
+          <w:szCs w:val="26"/>
+        </w:rPr>
+      </w:pPr>
+      <w:r>
+        <w:rPr>
+          <w:sz w:val="26"/>
+          <w:szCs w:val="26"/>
+        </w:rPr>
+        <w:t>Bệnh nhân đến phòng khám theo lịch đã được đặt trước.</w:t>
+      </w:r>
+    </w:p>
+    <w:p>
+      <w:pPr>
+        <w:pStyle w:val="NormalWeb"/>
+        <w:ind w:left="360" w:firstLine="360"/>
+        <w:rPr>
+          <w:sz w:val="26"/>
+          <w:szCs w:val="26"/>
+        </w:rPr>
+      </w:pPr>
+      <w:r>
+        <w:rPr>
+          <w:rStyle w:val="Strong"/>
+          <w:sz w:val="26"/>
+          <w:szCs w:val="26"/>
+        </w:rPr>
         <w:lastRenderedPageBreak/>
-        <w:t>Bước 1: Bệnh nhân đến phòng khám</w:t>
+        <w:t>Bước 2: Tiếp nhận bệnh nhân</w:t>
       </w:r>
     </w:p>
     <w:p>
@@ -1749,7 +1787,7 @@
           <w:sz w:val="26"/>
           <w:szCs w:val="26"/>
         </w:rPr>
-        <w:t>Bệnh nhân đến phòng khám theo lịch đã được đặt trước.</w:t>
+        <w:t>Nhân viên xác nhận thông tin bệnh nhân và kiểm tra lịch hẹn tương ứng.</w:t>
       </w:r>
     </w:p>
     <w:p>
@@ -1767,7 +1805,24 @@
           <w:sz w:val="26"/>
           <w:szCs w:val="26"/>
         </w:rPr>
-        <w:t>Bước 2: Tiếp nhận bệnh nhân</w:t>
+        <w:t>Bước 3: Kiểm tra kế hoạch điều trị</w:t>
+      </w:r>
+    </w:p>
+    <w:p>
+      <w:pPr>
+        <w:pStyle w:val="NormalWeb"/>
+        <w:ind w:left="720"/>
+        <w:rPr>
+          <w:sz w:val="26"/>
+          <w:szCs w:val="26"/>
+        </w:rPr>
+      </w:pPr>
+      <w:r>
+        <w:rPr>
+          <w:sz w:val="26"/>
+          <w:szCs w:val="26"/>
+        </w:rPr>
+        <w:t>Nhân viên hoặc bác sĩ kiểm tra bệnh nhân đang có kế hoạch điều trị nào và đang ở giai đoạn nào.</w:t>
       </w:r>
     </w:p>
     <w:p>
@@ -1781,10 +1836,28 @@
       </w:pPr>
       <w:r>
         <w:rPr>
-          <w:sz w:val="26"/>
-          <w:szCs w:val="26"/>
-        </w:rPr>
-        <w:t>Nhân viên xác nhận thông tin bệnh nhân và kiểm tra lịch hẹn tương ứng.</w:t>
+          <w:rStyle w:val="Strong"/>
+          <w:sz w:val="26"/>
+          <w:szCs w:val="26"/>
+        </w:rPr>
+        <w:t>Bước 4: Kiểm tra lịch sử điều trị</w:t>
+      </w:r>
+    </w:p>
+    <w:p>
+      <w:pPr>
+        <w:pStyle w:val="NormalWeb"/>
+        <w:ind w:left="720"/>
+        <w:rPr>
+          <w:sz w:val="26"/>
+          <w:szCs w:val="26"/>
+        </w:rPr>
+      </w:pPr>
+      <w:r>
+        <w:rPr>
+          <w:sz w:val="26"/>
+          <w:szCs w:val="26"/>
+        </w:rPr>
+        <w:t>Bác sĩ xem lại các buổi điều trị trước đó, những dịch vụ đã thực hiện và kết quả của các buổi trước.</w:t>
       </w:r>
     </w:p>
     <w:p>
@@ -1802,7 +1875,24 @@
           <w:sz w:val="26"/>
           <w:szCs w:val="26"/>
         </w:rPr>
-        <w:t>Bước 3: Kiểm tra kế hoạch điều trị</w:t>
+        <w:t>Bước 5: Kiểm tra tình trạng hiện tại</w:t>
+      </w:r>
+    </w:p>
+    <w:p>
+      <w:pPr>
+        <w:pStyle w:val="NormalWeb"/>
+        <w:ind w:left="720"/>
+        <w:rPr>
+          <w:sz w:val="26"/>
+          <w:szCs w:val="26"/>
+        </w:rPr>
+      </w:pPr>
+      <w:r>
+        <w:rPr>
+          <w:sz w:val="26"/>
+          <w:szCs w:val="26"/>
+        </w:rPr>
+        <w:t>Bác sĩ kiểm tra tình trạng răng miệng tại thời điểm bệnh nhân đến điều trị để xác định có thể tiếp tục theo kế hoạch hay cần đánh giá lại.</w:t>
       </w:r>
     </w:p>
     <w:p>
@@ -1816,10 +1906,28 @@
       </w:pPr>
       <w:r>
         <w:rPr>
-          <w:sz w:val="26"/>
-          <w:szCs w:val="26"/>
-        </w:rPr>
-        <w:t>Nhân viên hoặc bác sĩ kiểm tra bệnh nhân đang có kế hoạch điều trị nào và đang ở giai đoạn nào.</w:t>
+          <w:rStyle w:val="Strong"/>
+          <w:sz w:val="26"/>
+          <w:szCs w:val="26"/>
+        </w:rPr>
+        <w:t>Bước 6: Xác định nội dung buổi điều trị</w:t>
+      </w:r>
+    </w:p>
+    <w:p>
+      <w:pPr>
+        <w:pStyle w:val="NormalWeb"/>
+        <w:ind w:left="720"/>
+        <w:rPr>
+          <w:sz w:val="26"/>
+          <w:szCs w:val="26"/>
+        </w:rPr>
+      </w:pPr>
+      <w:r>
+        <w:rPr>
+          <w:sz w:val="26"/>
+          <w:szCs w:val="26"/>
+        </w:rPr>
+        <w:t>Bác sĩ xác định những dịch vụ cần thực hiện trong buổi hiện tại dựa trên kế hoạch và tình trạng thực tế.</w:t>
       </w:r>
     </w:p>
     <w:p>
@@ -1837,7 +1945,7 @@
           <w:sz w:val="26"/>
           <w:szCs w:val="26"/>
         </w:rPr>
-        <w:t>Bước 4: Kiểm tra lịch sử điều trị</w:t>
+        <w:t>Bước 7: Kiểm tra khả năng tiếp tục kế hoạch</w:t>
       </w:r>
     </w:p>
     <w:p>
@@ -1854,13 +1962,30 @@
           <w:sz w:val="26"/>
           <w:szCs w:val="26"/>
         </w:rPr>
-        <w:t>Bác sĩ xem lại các buổi điều trị trước đó, những dịch vụ đã thực hiện và kết quả của các buổi trước.</w:t>
-      </w:r>
-    </w:p>
-    <w:p>
-      <w:pPr>
-        <w:pStyle w:val="NormalWeb"/>
-        <w:ind w:left="360" w:firstLine="360"/>
+        <w:t>Nếu tình trạng phù hợp, bác sĩ tiếp tục thực hiện dịch vụ.</w:t>
+      </w:r>
+    </w:p>
+    <w:p>
+      <w:pPr>
+        <w:pStyle w:val="NormalWeb"/>
+        <w:ind w:left="720"/>
+        <w:rPr>
+          <w:sz w:val="26"/>
+          <w:szCs w:val="26"/>
+        </w:rPr>
+      </w:pPr>
+      <w:r>
+        <w:rPr>
+          <w:sz w:val="26"/>
+          <w:szCs w:val="26"/>
+        </w:rPr>
+        <w:t>Nếu phát hiện vấn đề ảnh hưởng đến kế hoạch, bác sĩ tạm dừng việc thực hiện và đánh giá lại để quyết định có cần điều chỉnh kế hoạch hay không.</w:t>
+      </w:r>
+    </w:p>
+    <w:p>
+      <w:pPr>
+        <w:pStyle w:val="NormalWeb"/>
+        <w:ind w:left="720"/>
         <w:rPr>
           <w:sz w:val="26"/>
           <w:szCs w:val="26"/>
@@ -1872,30 +1997,44 @@
           <w:sz w:val="26"/>
           <w:szCs w:val="26"/>
         </w:rPr>
-        <w:t>Bước 5: Kiểm tra tình trạng hiện tại</w:t>
-      </w:r>
-    </w:p>
-    <w:p>
-      <w:pPr>
-        <w:pStyle w:val="NormalWeb"/>
-        <w:ind w:left="720"/>
-        <w:rPr>
-          <w:sz w:val="26"/>
-          <w:szCs w:val="26"/>
-        </w:rPr>
-      </w:pPr>
-      <w:r>
-        <w:rPr>
-          <w:sz w:val="26"/>
-          <w:szCs w:val="26"/>
-        </w:rPr>
-        <w:t>Bác sĩ kiểm tra tình trạng răng miệng tại thời điểm bệnh nhân đến điều trị để xác định có thể tiếp tục theo kế hoạch hay cần đánh giá lại.</w:t>
-      </w:r>
-    </w:p>
-    <w:p>
-      <w:pPr>
-        <w:pStyle w:val="NormalWeb"/>
-        <w:ind w:left="360" w:firstLine="360"/>
+        <w:t>Bước 8: Thực hiện dịch vụ</w:t>
+      </w:r>
+    </w:p>
+    <w:p>
+      <w:pPr>
+        <w:pStyle w:val="NormalWeb"/>
+        <w:ind w:left="720"/>
+        <w:rPr>
+          <w:sz w:val="26"/>
+          <w:szCs w:val="26"/>
+        </w:rPr>
+      </w:pPr>
+      <w:r>
+        <w:rPr>
+          <w:sz w:val="26"/>
+          <w:szCs w:val="26"/>
+        </w:rPr>
+        <w:t>Bác sĩ thực hiện các dịch vụ được xác định cho buổi điều trị.</w:t>
+      </w:r>
+      <w:r>
+        <w:rPr>
+          <w:sz w:val="26"/>
+          <w:szCs w:val="26"/>
+        </w:rPr>
+        <w:t xml:space="preserve"> </w:t>
+      </w:r>
+      <w:r>
+        <w:rPr>
+          <w:sz w:val="26"/>
+          <w:szCs w:val="26"/>
+        </w:rPr>
+        <w:t>Y tá hỗ trợ bác sĩ trong quá trình điều trị theo nội dung được phân công, chuẩn bị và cung cấp dụng cụ, vật tư cần thiết.</w:t>
+      </w:r>
+    </w:p>
+    <w:p>
+      <w:pPr>
+        <w:pStyle w:val="NormalWeb"/>
+        <w:ind w:left="720"/>
         <w:rPr>
           <w:sz w:val="26"/>
           <w:szCs w:val="26"/>
@@ -1907,30 +2046,30 @@
           <w:sz w:val="26"/>
           <w:szCs w:val="26"/>
         </w:rPr>
-        <w:t>Bước 6: Xác định nội dung buổi điều trị</w:t>
-      </w:r>
-    </w:p>
-    <w:p>
-      <w:pPr>
-        <w:pStyle w:val="NormalWeb"/>
-        <w:ind w:left="720"/>
-        <w:rPr>
-          <w:sz w:val="26"/>
-          <w:szCs w:val="26"/>
-        </w:rPr>
-      </w:pPr>
-      <w:r>
-        <w:rPr>
-          <w:sz w:val="26"/>
-          <w:szCs w:val="26"/>
-        </w:rPr>
-        <w:t>Bác sĩ xác định những dịch vụ cần thực hiện trong buổi hiện tại dựa trên kế hoạch và tình trạng thực tế.</w:t>
-      </w:r>
-    </w:p>
-    <w:p>
-      <w:pPr>
-        <w:pStyle w:val="NormalWeb"/>
-        <w:ind w:left="360" w:firstLine="360"/>
+        <w:t>Bước 9: Đánh giá sau điều trị</w:t>
+      </w:r>
+    </w:p>
+    <w:p>
+      <w:pPr>
+        <w:pStyle w:val="NormalWeb"/>
+        <w:ind w:left="720"/>
+        <w:rPr>
+          <w:sz w:val="26"/>
+          <w:szCs w:val="26"/>
+        </w:rPr>
+      </w:pPr>
+      <w:r>
+        <w:rPr>
+          <w:sz w:val="26"/>
+          <w:szCs w:val="26"/>
+        </w:rPr>
+        <w:t>Sau khi thực hiện, bác sĩ kiểm tra tình trạng và đánh giá kết quả của buổi điều trị.</w:t>
+      </w:r>
+    </w:p>
+    <w:p>
+      <w:pPr>
+        <w:pStyle w:val="NormalWeb"/>
+        <w:ind w:left="720"/>
         <w:rPr>
           <w:sz w:val="26"/>
           <w:szCs w:val="26"/>
@@ -1942,41 +2081,24 @@
           <w:sz w:val="26"/>
           <w:szCs w:val="26"/>
         </w:rPr>
-        <w:t>Bước 7: Kiểm tra khả năng tiếp tục kế hoạch</w:t>
-      </w:r>
-    </w:p>
-    <w:p>
-      <w:pPr>
-        <w:pStyle w:val="NormalWeb"/>
-        <w:ind w:left="360" w:firstLine="360"/>
-        <w:rPr>
-          <w:sz w:val="26"/>
-          <w:szCs w:val="26"/>
-        </w:rPr>
-      </w:pPr>
-      <w:r>
-        <w:rPr>
-          <w:sz w:val="26"/>
-          <w:szCs w:val="26"/>
-        </w:rPr>
-        <w:t>Nếu tình trạng phù hợp, bác sĩ tiếp tục thực hiện dịch vụ.</w:t>
-      </w:r>
-    </w:p>
-    <w:p>
-      <w:pPr>
-        <w:pStyle w:val="NormalWeb"/>
-        <w:ind w:left="720"/>
-        <w:rPr>
-          <w:sz w:val="26"/>
-          <w:szCs w:val="26"/>
-        </w:rPr>
-      </w:pPr>
-      <w:r>
-        <w:rPr>
-          <w:sz w:val="26"/>
-          <w:szCs w:val="26"/>
-        </w:rPr>
-        <w:t>Nếu phát hiện vấn đề ảnh hưởng đến kế hoạch, bác sĩ tạm dừng việc thực hiện và đánh giá lại để quyết định có cần điều chỉnh kế hoạch hay không.</w:t>
+        <w:t>Bước 10: Ghi nhận nội dung điều trị</w:t>
+      </w:r>
+    </w:p>
+    <w:p>
+      <w:pPr>
+        <w:pStyle w:val="NormalWeb"/>
+        <w:ind w:left="720"/>
+        <w:rPr>
+          <w:sz w:val="26"/>
+          <w:szCs w:val="26"/>
+        </w:rPr>
+      </w:pPr>
+      <w:r>
+        <w:rPr>
+          <w:sz w:val="26"/>
+          <w:szCs w:val="26"/>
+        </w:rPr>
+        <w:t>Bác sĩ ghi nhận các dịch vụ đã thực hiện, vị trí điều trị nếu cần, tình trạng trước và sau điều trị, kết quả và các ghi chú chuyên môn.</w:t>
       </w:r>
     </w:p>
     <w:p>
@@ -1994,91 +2116,7 @@
           <w:sz w:val="26"/>
           <w:szCs w:val="26"/>
         </w:rPr>
-        <w:t>Bước 8: Thực hiện dịch vụ</w:t>
-      </w:r>
-    </w:p>
-    <w:p>
-      <w:pPr>
-        <w:pStyle w:val="NormalWeb"/>
-        <w:ind w:left="720"/>
-        <w:rPr>
-          <w:sz w:val="26"/>
-          <w:szCs w:val="26"/>
-        </w:rPr>
-      </w:pPr>
-      <w:r>
-        <w:rPr>
-          <w:sz w:val="26"/>
-          <w:szCs w:val="26"/>
-        </w:rPr>
-        <w:t>Bác sĩ thực hiện các dịch vụ được xác định cho buổi điều trị.</w:t>
-      </w:r>
-      <w:r>
-        <w:rPr>
-          <w:sz w:val="26"/>
-          <w:szCs w:val="26"/>
-        </w:rPr>
-        <w:t xml:space="preserve"> </w:t>
-      </w:r>
-      <w:r>
-        <w:rPr>
-          <w:sz w:val="26"/>
-          <w:szCs w:val="26"/>
-        </w:rPr>
-        <w:t>Y tá hỗ trợ bác sĩ trong quá trình điều trị theo nội dung được phân công, chuẩn bị và cung cấp dụng cụ, vật tư cần thiết.</w:t>
-      </w:r>
-    </w:p>
-    <w:p>
-      <w:pPr>
-        <w:pStyle w:val="NormalWeb"/>
-        <w:ind w:left="720"/>
-        <w:rPr>
-          <w:sz w:val="26"/>
-          <w:szCs w:val="26"/>
-        </w:rPr>
-      </w:pPr>
-      <w:r>
-        <w:rPr>
-          <w:rStyle w:val="Strong"/>
-          <w:sz w:val="26"/>
-          <w:szCs w:val="26"/>
-        </w:rPr>
-        <w:t>Bước 9: Đánh giá sau điều trị</w:t>
-      </w:r>
-    </w:p>
-    <w:p>
-      <w:pPr>
-        <w:pStyle w:val="NormalWeb"/>
-        <w:ind w:left="720"/>
-        <w:rPr>
-          <w:sz w:val="26"/>
-          <w:szCs w:val="26"/>
-        </w:rPr>
-      </w:pPr>
-      <w:r>
-        <w:rPr>
-          <w:sz w:val="26"/>
-          <w:szCs w:val="26"/>
-        </w:rPr>
-        <w:t>Sau khi thực hiện, bác sĩ kiểm tra tình trạng và đánh giá kết quả của buổi điều trị.</w:t>
-      </w:r>
-    </w:p>
-    <w:p>
-      <w:pPr>
-        <w:pStyle w:val="NormalWeb"/>
-        <w:ind w:left="720"/>
-        <w:rPr>
-          <w:sz w:val="26"/>
-          <w:szCs w:val="26"/>
-        </w:rPr>
-      </w:pPr>
-      <w:r>
-        <w:rPr>
-          <w:rStyle w:val="Strong"/>
-          <w:sz w:val="26"/>
-          <w:szCs w:val="26"/>
-        </w:rPr>
-        <w:t>Bước 10: Ghi nhận nội dung điều trị</w:t>
+        <w:t>Bước 11: Xác nhận buổi điều trị</w:t>
       </w:r>
     </w:p>
     <w:p>
@@ -2096,41 +2134,6 @@
           <w:szCs w:val="26"/>
         </w:rPr>
         <w:lastRenderedPageBreak/>
-        <w:t>Bác sĩ ghi nhận các dịch vụ đã thực hiện, vị trí điều trị nếu cần, tình trạng trước và sau điều trị, kết quả và các ghi chú chuyên môn.</w:t>
-      </w:r>
-    </w:p>
-    <w:p>
-      <w:pPr>
-        <w:pStyle w:val="NormalWeb"/>
-        <w:ind w:left="720"/>
-        <w:rPr>
-          <w:sz w:val="26"/>
-          <w:szCs w:val="26"/>
-        </w:rPr>
-      </w:pPr>
-      <w:r>
-        <w:rPr>
-          <w:rStyle w:val="Strong"/>
-          <w:sz w:val="26"/>
-          <w:szCs w:val="26"/>
-        </w:rPr>
-        <w:t>Bước 11: Xác nhận buổi điều trị</w:t>
-      </w:r>
-    </w:p>
-    <w:p>
-      <w:pPr>
-        <w:pStyle w:val="NormalWeb"/>
-        <w:ind w:left="720"/>
-        <w:rPr>
-          <w:sz w:val="26"/>
-          <w:szCs w:val="26"/>
-        </w:rPr>
-      </w:pPr>
-      <w:r>
-        <w:rPr>
-          <w:sz w:val="26"/>
-          <w:szCs w:val="26"/>
-        </w:rPr>
         <w:t>Bác sĩ xác nhận buổi điều trị đã được thực hiện và hoàn tất.</w:t>
       </w:r>
     </w:p>
@@ -2568,82 +2571,82 @@
           <w:sz w:val="26"/>
           <w:szCs w:val="26"/>
         </w:rPr>
+        <w:t>Bước 1:</w:t>
+      </w:r>
+      <w:r>
+        <w:rPr>
+          <w:sz w:val="26"/>
+          <w:szCs w:val="26"/>
+        </w:rPr>
+        <w:t xml:space="preserve"> Bác sĩ phát hiện vấn đề mới trong quá trình điều trị hoặc tái khám.</w:t>
+      </w:r>
+    </w:p>
+    <w:p>
+      <w:pPr>
+        <w:pStyle w:val="NormalWeb"/>
+        <w:ind w:left="720"/>
+        <w:rPr>
+          <w:sz w:val="26"/>
+          <w:szCs w:val="26"/>
+        </w:rPr>
+      </w:pPr>
+      <w:r>
+        <w:rPr>
+          <w:rStyle w:val="Strong"/>
+          <w:sz w:val="26"/>
+          <w:szCs w:val="26"/>
+        </w:rPr>
+        <w:t>Bước 2:</w:t>
+      </w:r>
+      <w:r>
+        <w:rPr>
+          <w:sz w:val="26"/>
+          <w:szCs w:val="26"/>
+        </w:rPr>
+        <w:t xml:space="preserve"> Bác sĩ xem lại kế hoạch hiện tại và lịch sử điều trị.</w:t>
+      </w:r>
+    </w:p>
+    <w:p>
+      <w:pPr>
+        <w:pStyle w:val="NormalWeb"/>
+        <w:ind w:left="720"/>
+        <w:rPr>
+          <w:sz w:val="26"/>
+          <w:szCs w:val="26"/>
+        </w:rPr>
+      </w:pPr>
+      <w:r>
+        <w:rPr>
+          <w:rStyle w:val="Strong"/>
+          <w:sz w:val="26"/>
+          <w:szCs w:val="26"/>
+        </w:rPr>
+        <w:t>Bước 3:</w:t>
+      </w:r>
+      <w:r>
+        <w:rPr>
+          <w:sz w:val="26"/>
+          <w:szCs w:val="26"/>
+        </w:rPr>
+        <w:t xml:space="preserve"> Bác sĩ đánh giá nguyên nhân khiến kế hoạch cần thay đổi.</w:t>
+      </w:r>
+    </w:p>
+    <w:p>
+      <w:pPr>
+        <w:pStyle w:val="NormalWeb"/>
+        <w:ind w:left="720"/>
+        <w:rPr>
+          <w:sz w:val="26"/>
+          <w:szCs w:val="26"/>
+        </w:rPr>
+      </w:pPr>
+      <w:r>
+        <w:rPr>
+          <w:rStyle w:val="Strong"/>
+          <w:sz w:val="26"/>
+          <w:szCs w:val="26"/>
+        </w:rPr>
         <w:lastRenderedPageBreak/>
-        <w:t>Bước 1:</w:t>
-      </w:r>
-      <w:r>
-        <w:rPr>
-          <w:sz w:val="26"/>
-          <w:szCs w:val="26"/>
-        </w:rPr>
-        <w:t xml:space="preserve"> Bác sĩ phát hiện vấn đề mới trong quá trình điều trị hoặc tái khám.</w:t>
-      </w:r>
-    </w:p>
-    <w:p>
-      <w:pPr>
-        <w:pStyle w:val="NormalWeb"/>
-        <w:ind w:left="720"/>
-        <w:rPr>
-          <w:sz w:val="26"/>
-          <w:szCs w:val="26"/>
-        </w:rPr>
-      </w:pPr>
-      <w:r>
-        <w:rPr>
-          <w:rStyle w:val="Strong"/>
-          <w:sz w:val="26"/>
-          <w:szCs w:val="26"/>
-        </w:rPr>
-        <w:t>Bước 2:</w:t>
-      </w:r>
-      <w:r>
-        <w:rPr>
-          <w:sz w:val="26"/>
-          <w:szCs w:val="26"/>
-        </w:rPr>
-        <w:t xml:space="preserve"> Bác sĩ xem lại kế hoạch hiện tại và lịch sử điều trị.</w:t>
-      </w:r>
-    </w:p>
-    <w:p>
-      <w:pPr>
-        <w:pStyle w:val="NormalWeb"/>
-        <w:ind w:left="720"/>
-        <w:rPr>
-          <w:sz w:val="26"/>
-          <w:szCs w:val="26"/>
-        </w:rPr>
-      </w:pPr>
-      <w:r>
-        <w:rPr>
-          <w:rStyle w:val="Strong"/>
-          <w:sz w:val="26"/>
-          <w:szCs w:val="26"/>
-        </w:rPr>
-        <w:t>Bước 3:</w:t>
-      </w:r>
-      <w:r>
-        <w:rPr>
-          <w:sz w:val="26"/>
-          <w:szCs w:val="26"/>
-        </w:rPr>
-        <w:t xml:space="preserve"> Bác sĩ đánh giá nguyên nhân khiến kế hoạch cần thay đổi.</w:t>
-      </w:r>
-    </w:p>
-    <w:p>
-      <w:pPr>
-        <w:pStyle w:val="NormalWeb"/>
-        <w:ind w:left="720"/>
-        <w:rPr>
-          <w:sz w:val="26"/>
-          <w:szCs w:val="26"/>
-        </w:rPr>
-      </w:pPr>
-      <w:r>
-        <w:rPr>
-          <w:rStyle w:val="Strong"/>
-          <w:sz w:val="26"/>
-          <w:szCs w:val="26"/>
-        </w:rPr>
         <w:t>Bước 4:</w:t>
       </w:r>
       <w:r>
@@ -3062,60 +3065,60 @@
           <w:sz w:val="26"/>
           <w:szCs w:val="26"/>
         </w:rPr>
+        <w:t>Nhân viên thông báo thời gian dự kiến và thống nhất thời gian với bệnh nhân.</w:t>
+      </w:r>
+    </w:p>
+    <w:p>
+      <w:pPr>
+        <w:pStyle w:val="NormalWeb"/>
+        <w:ind w:left="720"/>
+        <w:rPr>
+          <w:sz w:val="26"/>
+          <w:szCs w:val="26"/>
+        </w:rPr>
+      </w:pPr>
+      <w:r>
+        <w:rPr>
+          <w:rStyle w:val="Strong"/>
+          <w:sz w:val="26"/>
+          <w:szCs w:val="26"/>
+        </w:rPr>
+        <w:t>Bước 6: Kiểm tra trùng lịch</w:t>
+      </w:r>
+    </w:p>
+    <w:p>
+      <w:pPr>
+        <w:pStyle w:val="NormalWeb"/>
+        <w:ind w:left="720"/>
+        <w:rPr>
+          <w:sz w:val="26"/>
+          <w:szCs w:val="26"/>
+        </w:rPr>
+      </w:pPr>
+      <w:r>
+        <w:rPr>
+          <w:sz w:val="26"/>
+          <w:szCs w:val="26"/>
+        </w:rPr>
+        <w:t>Nhân viên kiểm tra xem thời gian lựa chọn có bị trùng với lịch làm việc hoặc lịch hẹn khác hay không.</w:t>
+      </w:r>
+    </w:p>
+    <w:p>
+      <w:pPr>
+        <w:pStyle w:val="NormalWeb"/>
+        <w:ind w:left="720"/>
+        <w:rPr>
+          <w:sz w:val="26"/>
+          <w:szCs w:val="26"/>
+        </w:rPr>
+      </w:pPr>
+      <w:r>
+        <w:rPr>
+          <w:rStyle w:val="Strong"/>
+          <w:sz w:val="26"/>
+          <w:szCs w:val="26"/>
+        </w:rPr>
         <w:lastRenderedPageBreak/>
-        <w:t>Nhân viên thông báo thời gian dự kiến và thống nhất thời gian với bệnh nhân.</w:t>
-      </w:r>
-    </w:p>
-    <w:p>
-      <w:pPr>
-        <w:pStyle w:val="NormalWeb"/>
-        <w:ind w:left="720"/>
-        <w:rPr>
-          <w:sz w:val="26"/>
-          <w:szCs w:val="26"/>
-        </w:rPr>
-      </w:pPr>
-      <w:r>
-        <w:rPr>
-          <w:rStyle w:val="Strong"/>
-          <w:sz w:val="26"/>
-          <w:szCs w:val="26"/>
-        </w:rPr>
-        <w:t>Bước 6: Kiểm tra trùng lịch</w:t>
-      </w:r>
-    </w:p>
-    <w:p>
-      <w:pPr>
-        <w:pStyle w:val="NormalWeb"/>
-        <w:ind w:left="720"/>
-        <w:rPr>
-          <w:sz w:val="26"/>
-          <w:szCs w:val="26"/>
-        </w:rPr>
-      </w:pPr>
-      <w:r>
-        <w:rPr>
-          <w:sz w:val="26"/>
-          <w:szCs w:val="26"/>
-        </w:rPr>
-        <w:t>Nhân viên kiểm tra xem thời gian lựa chọn có bị trùng với lịch làm việc hoặc lịch hẹn khác hay không.</w:t>
-      </w:r>
-    </w:p>
-    <w:p>
-      <w:pPr>
-        <w:pStyle w:val="NormalWeb"/>
-        <w:ind w:left="720"/>
-        <w:rPr>
-          <w:sz w:val="26"/>
-          <w:szCs w:val="26"/>
-        </w:rPr>
-      </w:pPr>
-      <w:r>
-        <w:rPr>
-          <w:rStyle w:val="Strong"/>
-          <w:sz w:val="26"/>
-          <w:szCs w:val="26"/>
-        </w:rPr>
         <w:t>Bước 7: Tạo lịch tái khám</w:t>
       </w:r>
     </w:p>
@@ -3610,115 +3613,115 @@
           <w:sz w:val="26"/>
           <w:szCs w:val="26"/>
         </w:rPr>
+        <w:t>Trường hợp bệnh nhân không đến</w:t>
+      </w:r>
+    </w:p>
+    <w:p>
+      <w:pPr>
+        <w:spacing w:before="100" w:beforeAutospacing="1" w:afterLines="120" w:after="288" w:line="240" w:lineRule="auto"/>
+        <w:ind w:left="720"/>
+        <w:rPr>
+          <w:rFonts w:ascii="Times New Roman" w:eastAsia="Times New Roman" w:hAnsi="Times New Roman" w:cs="Times New Roman"/>
+          <w:sz w:val="26"/>
+          <w:szCs w:val="26"/>
+        </w:rPr>
+      </w:pPr>
+      <w:r>
+        <w:rPr>
+          <w:rFonts w:ascii="Times New Roman" w:eastAsia="Times New Roman" w:hAnsi="Times New Roman" w:cs="Times New Roman"/>
+          <w:b/>
+          <w:bCs/>
+          <w:sz w:val="26"/>
+          <w:szCs w:val="26"/>
+        </w:rPr>
+        <w:t>Bước 1:</w:t>
+      </w:r>
+      <w:r>
+        <w:rPr>
+          <w:rFonts w:ascii="Times New Roman" w:eastAsia="Times New Roman" w:hAnsi="Times New Roman" w:cs="Times New Roman"/>
+          <w:sz w:val="26"/>
+          <w:szCs w:val="26"/>
+        </w:rPr>
+        <w:t xml:space="preserve"> Đến thời gian hẹn nhưng bệnh nhân không đến phòng khám.</w:t>
+      </w:r>
+    </w:p>
+    <w:p>
+      <w:pPr>
+        <w:spacing w:before="100" w:beforeAutospacing="1" w:afterLines="120" w:after="288" w:line="240" w:lineRule="auto"/>
+        <w:ind w:left="720"/>
+        <w:rPr>
+          <w:rFonts w:ascii="Times New Roman" w:eastAsia="Times New Roman" w:hAnsi="Times New Roman" w:cs="Times New Roman"/>
+          <w:sz w:val="26"/>
+          <w:szCs w:val="26"/>
+        </w:rPr>
+      </w:pPr>
+      <w:r>
+        <w:rPr>
+          <w:rFonts w:ascii="Times New Roman" w:eastAsia="Times New Roman" w:hAnsi="Times New Roman" w:cs="Times New Roman"/>
+          <w:b/>
+          <w:bCs/>
+          <w:sz w:val="26"/>
+          <w:szCs w:val="26"/>
+        </w:rPr>
+        <w:t>Bước 2:</w:t>
+      </w:r>
+      <w:r>
+        <w:rPr>
+          <w:rFonts w:ascii="Times New Roman" w:eastAsia="Times New Roman" w:hAnsi="Times New Roman" w:cs="Times New Roman"/>
+          <w:sz w:val="26"/>
+          <w:szCs w:val="26"/>
+        </w:rPr>
+        <w:t xml:space="preserve"> Nhân viên kiểm tra tình trạng lịch hẹn.</w:t>
+      </w:r>
+    </w:p>
+    <w:p>
+      <w:pPr>
+        <w:spacing w:before="100" w:beforeAutospacing="1" w:afterLines="120" w:after="288" w:line="240" w:lineRule="auto"/>
+        <w:ind w:left="720"/>
+        <w:rPr>
+          <w:rFonts w:ascii="Times New Roman" w:eastAsia="Times New Roman" w:hAnsi="Times New Roman" w:cs="Times New Roman"/>
+          <w:sz w:val="26"/>
+          <w:szCs w:val="26"/>
+        </w:rPr>
+      </w:pPr>
+      <w:r>
+        <w:rPr>
+          <w:rFonts w:ascii="Times New Roman" w:eastAsia="Times New Roman" w:hAnsi="Times New Roman" w:cs="Times New Roman"/>
+          <w:b/>
+          <w:bCs/>
+          <w:sz w:val="26"/>
+          <w:szCs w:val="26"/>
+        </w:rPr>
+        <w:t>Bước 3:</w:t>
+      </w:r>
+      <w:r>
+        <w:rPr>
+          <w:rFonts w:ascii="Times New Roman" w:eastAsia="Times New Roman" w:hAnsi="Times New Roman" w:cs="Times New Roman"/>
+          <w:sz w:val="26"/>
+          <w:szCs w:val="26"/>
+        </w:rPr>
+        <w:t xml:space="preserve"> Lịch được ghi nhận trạng thái không đến.</w:t>
+      </w:r>
+    </w:p>
+    <w:p>
+      <w:pPr>
+        <w:spacing w:before="100" w:beforeAutospacing="1" w:afterLines="120" w:after="288" w:line="240" w:lineRule="auto"/>
+        <w:ind w:left="720"/>
+        <w:rPr>
+          <w:rFonts w:ascii="Times New Roman" w:eastAsia="Times New Roman" w:hAnsi="Times New Roman" w:cs="Times New Roman"/>
+          <w:sz w:val="26"/>
+          <w:szCs w:val="26"/>
+        </w:rPr>
+      </w:pPr>
+      <w:r>
+        <w:rPr>
+          <w:rFonts w:ascii="Times New Roman" w:eastAsia="Times New Roman" w:hAnsi="Times New Roman" w:cs="Times New Roman"/>
+          <w:b/>
+          <w:bCs/>
+          <w:sz w:val="26"/>
+          <w:szCs w:val="26"/>
+        </w:rPr>
         <w:lastRenderedPageBreak/>
-        <w:t>Trường hợp bệnh nhân không đến</w:t>
-      </w:r>
-    </w:p>
-    <w:p>
-      <w:pPr>
-        <w:spacing w:before="100" w:beforeAutospacing="1" w:afterLines="120" w:after="288" w:line="240" w:lineRule="auto"/>
-        <w:ind w:left="720"/>
-        <w:rPr>
-          <w:rFonts w:ascii="Times New Roman" w:eastAsia="Times New Roman" w:hAnsi="Times New Roman" w:cs="Times New Roman"/>
-          <w:sz w:val="26"/>
-          <w:szCs w:val="26"/>
-        </w:rPr>
-      </w:pPr>
-      <w:r>
-        <w:rPr>
-          <w:rFonts w:ascii="Times New Roman" w:eastAsia="Times New Roman" w:hAnsi="Times New Roman" w:cs="Times New Roman"/>
-          <w:b/>
-          <w:bCs/>
-          <w:sz w:val="26"/>
-          <w:szCs w:val="26"/>
-        </w:rPr>
-        <w:t>Bước 1:</w:t>
-      </w:r>
-      <w:r>
-        <w:rPr>
-          <w:rFonts w:ascii="Times New Roman" w:eastAsia="Times New Roman" w:hAnsi="Times New Roman" w:cs="Times New Roman"/>
-          <w:sz w:val="26"/>
-          <w:szCs w:val="26"/>
-        </w:rPr>
-        <w:t xml:space="preserve"> Đến thời gian hẹn nhưng bệnh nhân không đến phòng khám.</w:t>
-      </w:r>
-    </w:p>
-    <w:p>
-      <w:pPr>
-        <w:spacing w:before="100" w:beforeAutospacing="1" w:afterLines="120" w:after="288" w:line="240" w:lineRule="auto"/>
-        <w:ind w:left="720"/>
-        <w:rPr>
-          <w:rFonts w:ascii="Times New Roman" w:eastAsia="Times New Roman" w:hAnsi="Times New Roman" w:cs="Times New Roman"/>
-          <w:sz w:val="26"/>
-          <w:szCs w:val="26"/>
-        </w:rPr>
-      </w:pPr>
-      <w:r>
-        <w:rPr>
-          <w:rFonts w:ascii="Times New Roman" w:eastAsia="Times New Roman" w:hAnsi="Times New Roman" w:cs="Times New Roman"/>
-          <w:b/>
-          <w:bCs/>
-          <w:sz w:val="26"/>
-          <w:szCs w:val="26"/>
-        </w:rPr>
-        <w:t>Bước 2:</w:t>
-      </w:r>
-      <w:r>
-        <w:rPr>
-          <w:rFonts w:ascii="Times New Roman" w:eastAsia="Times New Roman" w:hAnsi="Times New Roman" w:cs="Times New Roman"/>
-          <w:sz w:val="26"/>
-          <w:szCs w:val="26"/>
-        </w:rPr>
-        <w:t xml:space="preserve"> Nhân viên kiểm tra tình trạng lịch hẹn.</w:t>
-      </w:r>
-    </w:p>
-    <w:p>
-      <w:pPr>
-        <w:spacing w:before="100" w:beforeAutospacing="1" w:afterLines="120" w:after="288" w:line="240" w:lineRule="auto"/>
-        <w:ind w:left="720"/>
-        <w:rPr>
-          <w:rFonts w:ascii="Times New Roman" w:eastAsia="Times New Roman" w:hAnsi="Times New Roman" w:cs="Times New Roman"/>
-          <w:sz w:val="26"/>
-          <w:szCs w:val="26"/>
-        </w:rPr>
-      </w:pPr>
-      <w:r>
-        <w:rPr>
-          <w:rFonts w:ascii="Times New Roman" w:eastAsia="Times New Roman" w:hAnsi="Times New Roman" w:cs="Times New Roman"/>
-          <w:b/>
-          <w:bCs/>
-          <w:sz w:val="26"/>
-          <w:szCs w:val="26"/>
-        </w:rPr>
-        <w:t>Bước 3:</w:t>
-      </w:r>
-      <w:r>
-        <w:rPr>
-          <w:rFonts w:ascii="Times New Roman" w:eastAsia="Times New Roman" w:hAnsi="Times New Roman" w:cs="Times New Roman"/>
-          <w:sz w:val="26"/>
-          <w:szCs w:val="26"/>
-        </w:rPr>
-        <w:t xml:space="preserve"> Lịch được ghi nhận trạng thái không đến.</w:t>
-      </w:r>
-    </w:p>
-    <w:p>
-      <w:pPr>
-        <w:spacing w:before="100" w:beforeAutospacing="1" w:afterLines="120" w:after="288" w:line="240" w:lineRule="auto"/>
-        <w:ind w:left="720"/>
-        <w:rPr>
-          <w:rFonts w:ascii="Times New Roman" w:eastAsia="Times New Roman" w:hAnsi="Times New Roman" w:cs="Times New Roman"/>
-          <w:sz w:val="26"/>
-          <w:szCs w:val="26"/>
-        </w:rPr>
-      </w:pPr>
-      <w:r>
-        <w:rPr>
-          <w:rFonts w:ascii="Times New Roman" w:eastAsia="Times New Roman" w:hAnsi="Times New Roman" w:cs="Times New Roman"/>
-          <w:b/>
-          <w:bCs/>
-          <w:sz w:val="26"/>
-          <w:szCs w:val="26"/>
-        </w:rPr>
         <w:t>Bước 4:</w:t>
       </w:r>
       <w:r>
@@ -4436,7 +4439,6 @@
           <w:sz w:val="26"/>
           <w:szCs w:val="26"/>
         </w:rPr>
-        <w:lastRenderedPageBreak/>
         <w:t>Bước 1</w:t>
       </w:r>
       <w:r>
@@ -4571,6 +4573,7 @@
           <w:sz w:val="26"/>
           <w:szCs w:val="26"/>
         </w:rPr>
+        <w:lastRenderedPageBreak/>
         <w:t>Bước 3:</w:t>
       </w:r>
       <w:r>
@@ -4938,59 +4941,59 @@
           <w:sz w:val="26"/>
           <w:szCs w:val="26"/>
         </w:rPr>
+        <w:t>Bước 5: Chuẩn bị trước buổi điều trị hoặc tái khám</w:t>
+      </w:r>
+    </w:p>
+    <w:p>
+      <w:pPr>
+        <w:pStyle w:val="NormalWeb"/>
+        <w:ind w:left="720"/>
+        <w:rPr>
+          <w:sz w:val="26"/>
+          <w:szCs w:val="26"/>
+        </w:rPr>
+      </w:pPr>
+      <w:r>
+        <w:rPr>
+          <w:sz w:val="26"/>
+          <w:szCs w:val="26"/>
+        </w:rPr>
+        <w:t>Dựa trên lịch và nội dung được phân công, y tá chuẩn bị phòng, dụng cụ, vật tư và các điều kiện cần thiết phục vụ cho buổi điều trị hoặc tái khám.</w:t>
+      </w:r>
+    </w:p>
+    <w:p>
+      <w:pPr>
+        <w:pStyle w:val="NormalWeb"/>
+        <w:ind w:left="720"/>
+        <w:rPr>
+          <w:sz w:val="26"/>
+          <w:szCs w:val="26"/>
+        </w:rPr>
+      </w:pPr>
+      <w:r>
+        <w:rPr>
+          <w:rStyle w:val="Strong"/>
+          <w:sz w:val="26"/>
+          <w:szCs w:val="26"/>
+        </w:rPr>
+        <w:t>Bước 6: Hỗ trợ bác sĩ</w:t>
+      </w:r>
+    </w:p>
+    <w:p>
+      <w:pPr>
+        <w:pStyle w:val="NormalWeb"/>
+        <w:ind w:left="720"/>
+        <w:rPr>
+          <w:sz w:val="26"/>
+          <w:szCs w:val="26"/>
+        </w:rPr>
+      </w:pPr>
+      <w:r>
+        <w:rPr>
+          <w:sz w:val="26"/>
+          <w:szCs w:val="26"/>
+        </w:rPr>
         <w:lastRenderedPageBreak/>
-        <w:t>Bước 5: Chuẩn bị trước buổi điều trị hoặc tái khám</w:t>
-      </w:r>
-    </w:p>
-    <w:p>
-      <w:pPr>
-        <w:pStyle w:val="NormalWeb"/>
-        <w:ind w:left="720"/>
-        <w:rPr>
-          <w:sz w:val="26"/>
-          <w:szCs w:val="26"/>
-        </w:rPr>
-      </w:pPr>
-      <w:r>
-        <w:rPr>
-          <w:sz w:val="26"/>
-          <w:szCs w:val="26"/>
-        </w:rPr>
-        <w:t>Dựa trên lịch và nội dung được phân công, y tá chuẩn bị phòng, dụng cụ, vật tư và các điều kiện cần thiết phục vụ cho buổi điều trị hoặc tái khám.</w:t>
-      </w:r>
-    </w:p>
-    <w:p>
-      <w:pPr>
-        <w:pStyle w:val="NormalWeb"/>
-        <w:ind w:left="720"/>
-        <w:rPr>
-          <w:sz w:val="26"/>
-          <w:szCs w:val="26"/>
-        </w:rPr>
-      </w:pPr>
-      <w:r>
-        <w:rPr>
-          <w:rStyle w:val="Strong"/>
-          <w:sz w:val="26"/>
-          <w:szCs w:val="26"/>
-        </w:rPr>
-        <w:t>Bước 6: Hỗ trợ bác sĩ</w:t>
-      </w:r>
-    </w:p>
-    <w:p>
-      <w:pPr>
-        <w:pStyle w:val="NormalWeb"/>
-        <w:ind w:left="720"/>
-        <w:rPr>
-          <w:sz w:val="26"/>
-          <w:szCs w:val="26"/>
-        </w:rPr>
-      </w:pPr>
-      <w:r>
-        <w:rPr>
-          <w:sz w:val="26"/>
-          <w:szCs w:val="26"/>
-        </w:rPr>
         <w:t>Khi đến thời gian được phân công, y tá hỗ trợ bác sĩ trong quá trình điều trị hoặc tái khám theo phạm vi công việc được giao.</w:t>
       </w:r>
     </w:p>
@@ -5268,32 +5271,32 @@
           <w:sz w:val="26"/>
           <w:szCs w:val="26"/>
         </w:rPr>
+        <w:t>Quy định 7: Về kết quả tái khám:</w:t>
+      </w:r>
+      <w:r>
+        <w:rPr>
+          <w:sz w:val="26"/>
+          <w:szCs w:val="26"/>
+        </w:rPr>
+        <w:t xml:space="preserve"> Kết quả mỗi lần tái khám phải được ghi nhận vào hồ sơ bệnh nhân và làm cơ sở để quyết định tiếp tục điều trị, điều chỉnh kế hoạch, tái khám tiếp hoặc hoàn tất điều trị.</w:t>
+      </w:r>
+    </w:p>
+    <w:p>
+      <w:pPr>
+        <w:pStyle w:val="NormalWeb"/>
+        <w:ind w:left="720"/>
+        <w:rPr>
+          <w:sz w:val="26"/>
+          <w:szCs w:val="26"/>
+        </w:rPr>
+      </w:pPr>
+      <w:r>
+        <w:rPr>
+          <w:rStyle w:val="Strong"/>
+          <w:sz w:val="26"/>
+          <w:szCs w:val="26"/>
+        </w:rPr>
         <w:lastRenderedPageBreak/>
-        <w:t>Quy định 7: Về kết quả tái khám:</w:t>
-      </w:r>
-      <w:r>
-        <w:rPr>
-          <w:sz w:val="26"/>
-          <w:szCs w:val="26"/>
-        </w:rPr>
-        <w:t xml:space="preserve"> Kết quả mỗi lần tái khám phải được ghi nhận vào hồ sơ bệnh nhân và làm cơ sở để quyết định tiếp tục điều trị, điều chỉnh kế hoạch, tái khám tiếp hoặc hoàn tất điều trị.</w:t>
-      </w:r>
-    </w:p>
-    <w:p>
-      <w:pPr>
-        <w:pStyle w:val="NormalWeb"/>
-        <w:ind w:left="720"/>
-        <w:rPr>
-          <w:sz w:val="26"/>
-          <w:szCs w:val="26"/>
-        </w:rPr>
-      </w:pPr>
-      <w:r>
-        <w:rPr>
-          <w:rStyle w:val="Strong"/>
-          <w:sz w:val="26"/>
-          <w:szCs w:val="26"/>
-        </w:rPr>
         <w:t>Quy định 8: Về hoàn tất điều trị:</w:t>
       </w:r>
       <w:r>
@@ -6452,7 +6455,6 @@
           <w:sz w:val="26"/>
           <w:szCs w:val="26"/>
         </w:rPr>
-        <w:lastRenderedPageBreak/>
         <w:t>Sơ đồ phân cấp chức năng của ứng dụn</w:t>
       </w:r>
       <w:r>
@@ -6532,6 +6534,7 @@
           <w:sz w:val="26"/>
           <w:szCs w:val="26"/>
         </w:rPr>
+        <w:lastRenderedPageBreak/>
         <w:t>Link nhật ký</w:t>
       </w:r>
     </w:p>
@@ -8466,6 +8469,7 @@
   <w:style w:type="character" w:default="1" w:styleId="DefaultParagraphFont">
     <w:name w:val="Default Paragraph Font"/>
     <w:uiPriority w:val="1"/>
+    <w:semiHidden/>
     <w:unhideWhenUsed/>
   </w:style>
   <w:style w:type="table" w:default="1" w:styleId="TableNormal">

</xml_diff>

<commit_message>
update bao cao v2
</commit_message>
<xml_diff>
--- a/doc/02-NguyenMinhThuan.docx
+++ b/doc/02-NguyenMinhThuan.docx
@@ -1135,7 +1135,7 @@
           <w:sz w:val="26"/>
           <w:szCs w:val="26"/>
         </w:rPr>
-        <w:t xml:space="preserve"> bằng cách xem lại lịch sử điều trị, kiểm tra tình trạng hiện tại và ghi nhận kết quả. Dựa trên kết quả tái khám, bác sĩ có thể xác định tình trạng đã ổn định, tiếp tục kế hoạch điều trị, điều chỉnh kế hoạch hoặc thực </w:t>
+        <w:t xml:space="preserve"> bằng cách xem lại lịch sử điều trị, kiểm tra tình trạng hiện tại và ghi nhận kết quả. Dựa trên kết quả tái khám, bác sĩ có </w:t>
       </w:r>
       <w:r>
         <w:rPr>
@@ -1143,7 +1143,7 @@
           <w:szCs w:val="26"/>
         </w:rPr>
         <w:lastRenderedPageBreak/>
-        <w:t>hiện thêm dịch vụ. Kết quả tái khám được lưu vào hồ sơ và là cơ sở cho các buổi điều trị hoặc lịch tái khám tiếp theo.</w:t>
+        <w:t>thể xác định tình trạng đã ổn định, tiếp tục kế hoạch điều trị, điều chỉnh kế hoạch hoặc thực hiện thêm dịch vụ. Kết quả tái khám được lưu vào hồ sơ và là cơ sở cho các buổi điều trị hoặc lịch tái khám tiếp theo.</w:t>
       </w:r>
     </w:p>
     <w:p>
@@ -1438,6 +1438,7 @@
           <w:sz w:val="26"/>
           <w:szCs w:val="26"/>
         </w:rPr>
+        <w:lastRenderedPageBreak/>
         <w:t>Bước 3: Xác định phương án điều trị</w:t>
       </w:r>
     </w:p>
@@ -1457,7 +1458,6 @@
           <w:sz w:val="26"/>
           <w:szCs w:val="26"/>
         </w:rPr>
-        <w:lastRenderedPageBreak/>
         <w:t>Dựa trên tình trạng thực tế, bác sĩ xác định phương án điều trị phù hợp. Một bệnh nhân có thể có nhiều vấn đề răng miệng và cần thực hiện nhiều dịch vụ khác nhau.</w:t>
       </w:r>
     </w:p>
@@ -1807,6 +1807,7 @@
           <w:sz w:val="26"/>
           <w:szCs w:val="26"/>
         </w:rPr>
+        <w:lastRenderedPageBreak/>
         <w:t>Quy trình thực hiện buổi điều trị</w:t>
       </w:r>
     </w:p>
@@ -1842,7 +1843,6 @@
           <w:sz w:val="26"/>
           <w:szCs w:val="26"/>
         </w:rPr>
-        <w:lastRenderedPageBreak/>
         <w:t>Bệnh nhân đến phòng khám theo lịch đã được đặt trước.</w:t>
       </w:r>
     </w:p>
@@ -2172,6 +2172,7 @@
           <w:sz w:val="26"/>
           <w:szCs w:val="26"/>
         </w:rPr>
+        <w:lastRenderedPageBreak/>
         <w:t>Bước 10: Ghi nhận nội dung điều trị</w:t>
       </w:r>
     </w:p>
@@ -2207,7 +2208,6 @@
           <w:sz w:val="26"/>
           <w:szCs w:val="26"/>
         </w:rPr>
-        <w:lastRenderedPageBreak/>
         <w:t>Bước 11: Xác nhận buổi điều trị</w:t>
       </w:r>
     </w:p>
@@ -2644,6 +2644,7 @@
           <w:sz w:val="26"/>
           <w:szCs w:val="26"/>
         </w:rPr>
+        <w:lastRenderedPageBreak/>
         <w:t>Quy trình điều chỉnh kế hoạch điều trị</w:t>
       </w:r>
     </w:p>
@@ -2712,7 +2713,6 @@
           <w:sz w:val="26"/>
           <w:szCs w:val="26"/>
         </w:rPr>
-        <w:lastRenderedPageBreak/>
         <w:t>Bước 3:</w:t>
       </w:r>
       <w:r>
@@ -3139,6 +3139,7 @@
           <w:sz w:val="26"/>
           <w:szCs w:val="26"/>
         </w:rPr>
+        <w:lastRenderedPageBreak/>
         <w:t>Bước 5: Trao đổi với bệnh nhân</w:t>
       </w:r>
     </w:p>
@@ -3191,7 +3192,6 @@
           <w:sz w:val="26"/>
           <w:szCs w:val="26"/>
         </w:rPr>
-        <w:lastRenderedPageBreak/>
         <w:t>Nhân viên kiểm tra xem thời gian lựa chọn có bị trùng với lịch làm việc hoặc lịch hẹn khác hay không.</w:t>
       </w:r>
     </w:p>
@@ -3669,6 +3669,7 @@
           <w:sz w:val="26"/>
           <w:szCs w:val="26"/>
         </w:rPr>
+        <w:lastRenderedPageBreak/>
         <w:t>Bước 4:</w:t>
       </w:r>
       <w:r>
@@ -3783,7 +3784,6 @@
           <w:sz w:val="26"/>
           <w:szCs w:val="26"/>
         </w:rPr>
-        <w:lastRenderedPageBreak/>
         <w:t>Bước 3:</w:t>
       </w:r>
       <w:r>
@@ -4481,6 +4481,7 @@
           <w:sz w:val="26"/>
           <w:szCs w:val="26"/>
         </w:rPr>
+        <w:lastRenderedPageBreak/>
         <w:t>Bước 1</w:t>
       </w:r>
       <w:r>
@@ -4635,7 +4636,6 @@
           <w:sz w:val="26"/>
           <w:szCs w:val="26"/>
         </w:rPr>
-        <w:lastRenderedPageBreak/>
         <w:t>Bước 2:</w:t>
       </w:r>
       <w:r>
@@ -5014,6 +5014,7 @@
           <w:sz w:val="26"/>
           <w:szCs w:val="26"/>
         </w:rPr>
+        <w:lastRenderedPageBreak/>
         <w:t>Y tá theo dõi trạng thái và các thay đổi liên quan đến lịch được phân công. Khi lịch được thay đổi, hủy hoặc phân công lại, thông tin trên hệ thống được cập nhật để y tá nắm được lịch làm việc mới.</w:t>
       </w:r>
     </w:p>
@@ -5084,7 +5085,6 @@
           <w:sz w:val="26"/>
           <w:szCs w:val="26"/>
         </w:rPr>
-        <w:lastRenderedPageBreak/>
         <w:t>Khi đến thời gian được phân công, y tá hỗ trợ bác sĩ trong quá trình điều trị hoặc tái khám theo phạm vi công việc được giao.</w:t>
       </w:r>
     </w:p>
@@ -5173,6 +5173,7 @@
           <w:sz w:val="26"/>
           <w:szCs w:val="26"/>
         </w:rPr>
+        <w:lastRenderedPageBreak/>
         <w:drawing>
           <wp:inline distT="0" distB="0" distL="0" distR="0" wp14:anchorId="041E02EA" wp14:editId="302AC97D">
             <wp:extent cx="5994944" cy="4747895"/>
@@ -5295,7 +5296,6 @@
           <w:sz w:val="26"/>
           <w:szCs w:val="26"/>
         </w:rPr>
-        <w:lastRenderedPageBreak/>
         <w:t>Quy định 2: Về số buổi điều trị:</w:t>
       </w:r>
       <w:r>
@@ -5371,6 +5371,7 @@
           <w:sz w:val="26"/>
           <w:szCs w:val="26"/>
         </w:rPr>
+        <w:lastRenderedPageBreak/>
         <w:t>Quy định 5: Về điều chỉnh kế hoạch:</w:t>
       </w:r>
       <w:r>
@@ -5770,16 +5771,7 @@
                 <w:sz w:val="26"/>
                 <w:szCs w:val="26"/>
               </w:rPr>
-              <w:t xml:space="preserve">Sau khi bệnh nhân hoàn thành một lần điều trị, hệ thống có cần cho phép bác sĩ hoặc nhân viên tạo lịch tái khám tiếp theo không? Nếu </w:t>
-            </w:r>
-            <w:r>
-              <w:rPr>
-                <w:rFonts w:ascii="Times New Roman" w:hAnsi="Times New Roman" w:cs="Times New Roman"/>
-                <w:sz w:val="26"/>
-                <w:szCs w:val="26"/>
-              </w:rPr>
-              <w:lastRenderedPageBreak/>
-              <w:t>có, tôi đề xuất lưu các thông tin gồm ngày tái khám, nội dung cần tái khám và bác sĩ phụ trách, đồng thời hệ thống hiển thị trạng thái như chưa tái khám, đã tái khám hoặc quá hạn để thuận tiện theo dõi. Cách xử lý này có phù hợp với quy trình thực tế của phòng khám không?</w:t>
+              <w:t>Sau khi bệnh nhân hoàn thành một lần điều trị, hệ thống có cần cho phép bác sĩ hoặc nhân viên tạo lịch tái khám tiếp theo không? Nếu có, tôi đề xuất lưu các thông tin gồm ngày tái khám, nội dung cần tái khám và bác sĩ phụ trách, đồng thời hệ thống hiển thị trạng thái như chưa tái khám, đã tái khám hoặc quá hạn để thuận tiện theo dõi. Cách xử lý này có phù hợp với quy trình thực tế của phòng khám không?</w:t>
             </w:r>
           </w:p>
         </w:tc>
@@ -5804,17 +5796,7 @@
                 <w:sz w:val="26"/>
                 <w:szCs w:val="26"/>
               </w:rPr>
-              <w:lastRenderedPageBreak/>
-              <w:t xml:space="preserve">Có. Hệ thống cần cho phép tạo lịch tái khám sau mỗi lần điều trị. Thông tin lịch tái khám gồm ngày tái khám, nội dung cần thực hiện và bác sĩ phụ trách. Hệ thống cũng cần theo dõi </w:t>
-            </w:r>
-            <w:r>
-              <w:rPr>
-                <w:rFonts w:ascii="Times New Roman" w:hAnsi="Times New Roman" w:cs="Times New Roman"/>
-                <w:sz w:val="26"/>
-                <w:szCs w:val="26"/>
-              </w:rPr>
-              <w:lastRenderedPageBreak/>
-              <w:t>trạng thái của lịch tái khám để nhân viên dễ dàng quản lý và nhắc bệnh nhân khi cần thiết.</w:t>
+              <w:t>Có. Hệ thống cần cho phép tạo lịch tái khám sau mỗi lần điều trị. Thông tin lịch tái khám gồm ngày tái khám, nội dung cần thực hiện và bác sĩ phụ trách. Hệ thống cũng cần theo dõi trạng thái của lịch tái khám để nhân viên dễ dàng quản lý và nhắc bệnh nhân khi cần thiết.</w:t>
             </w:r>
           </w:p>
         </w:tc>
@@ -5838,17 +5820,7 @@
                 <w:sz w:val="26"/>
                 <w:szCs w:val="26"/>
               </w:rPr>
-              <w:lastRenderedPageBreak/>
-              <w:t xml:space="preserve">Cần làm rõ thêm quy tắc xác định lịch tái khám và thời điểm hệ </w:t>
-            </w:r>
-            <w:r>
-              <w:rPr>
-                <w:rFonts w:ascii="Times New Roman" w:hAnsi="Times New Roman" w:cs="Times New Roman"/>
-                <w:sz w:val="26"/>
-                <w:szCs w:val="26"/>
-              </w:rPr>
-              <w:lastRenderedPageBreak/>
-              <w:t>thống thông báo/nhắc bệnh nhân.</w:t>
+              <w:t>Cần làm rõ thêm quy tắc xác định lịch tái khám và thời điểm hệ thống thông báo/nhắc bệnh nhân.</w:t>
             </w:r>
           </w:p>
         </w:tc>
@@ -6676,7 +6648,7 @@
       <w:pPr>
         <w:pStyle w:val="ListParagraph"/>
         <w:spacing w:afterLines="120" w:after="288" w:line="240" w:lineRule="auto"/>
-        <w:ind w:left="284"/>
+        <w:ind w:left="1440"/>
         <w:jc w:val="both"/>
         <w:rPr>
           <w:rFonts w:ascii="Times New Roman" w:hAnsi="Times New Roman" w:cs="Times New Roman"/>
@@ -6691,7 +6663,181 @@
         <w:pStyle w:val="ListParagraph"/>
         <w:numPr>
           <w:ilvl w:val="0"/>
-          <w:numId w:val="14"/>
+          <w:numId w:val="27"/>
+        </w:numPr>
+        <w:spacing w:after="0" w:line="240" w:lineRule="auto"/>
+        <w:rPr>
+          <w:rFonts w:ascii="Times New Roman" w:eastAsia="Times New Roman" w:hAnsi="Times New Roman" w:cs="Times New Roman"/>
+          <w:color w:val="1F1F1F"/>
+          <w:sz w:val="26"/>
+          <w:szCs w:val="26"/>
+          <w:u w:val="single"/>
+          <w:lang w:val="vi-VN" w:eastAsia="vi-VN"/>
+        </w:rPr>
+      </w:pPr>
+      <w:r>
+        <w:rPr>
+          <w:rFonts w:ascii="Times New Roman" w:eastAsia="Times New Roman" w:hAnsi="Times New Roman" w:cs="Times New Roman"/>
+          <w:color w:val="1F1F1F"/>
+          <w:sz w:val="26"/>
+          <w:szCs w:val="26"/>
+          <w:u w:val="single"/>
+          <w:lang w:val="vi-VN" w:eastAsia="vi-VN"/>
+        </w:rPr>
+        <w:t>Lễ tân:</w:t>
+      </w:r>
+    </w:p>
+    <w:p>
+      <w:pPr>
+        <w:pStyle w:val="ListParagraph"/>
+        <w:numPr>
+          <w:ilvl w:val="1"/>
+          <w:numId w:val="27"/>
+        </w:numPr>
+        <w:spacing w:after="120" w:line="240" w:lineRule="auto"/>
+        <w:jc w:val="both"/>
+        <w:rPr>
+          <w:rFonts w:ascii="Times New Roman" w:hAnsi="Times New Roman" w:cs="Times New Roman"/>
+          <w:b/>
+          <w:sz w:val="26"/>
+          <w:szCs w:val="26"/>
+        </w:rPr>
+      </w:pPr>
+      <w:r>
+        <w:rPr>
+          <w:rFonts w:ascii="Times New Roman" w:hAnsi="Times New Roman" w:cs="Times New Roman"/>
+          <w:bCs/>
+          <w:sz w:val="26"/>
+          <w:szCs w:val="26"/>
+        </w:rPr>
+        <w:t>Đăng</w:t>
+      </w:r>
+      <w:r>
+        <w:rPr>
+          <w:rFonts w:ascii="Times New Roman" w:hAnsi="Times New Roman" w:cs="Times New Roman"/>
+          <w:bCs/>
+          <w:sz w:val="26"/>
+          <w:szCs w:val="26"/>
+          <w:lang w:val="vi-VN"/>
+        </w:rPr>
+        <w:t xml:space="preserve"> nhập.</w:t>
+      </w:r>
+    </w:p>
+    <w:p>
+      <w:pPr>
+        <w:pStyle w:val="ListParagraph"/>
+        <w:numPr>
+          <w:ilvl w:val="1"/>
+          <w:numId w:val="27"/>
+        </w:numPr>
+        <w:spacing w:after="0" w:line="240" w:lineRule="auto"/>
+        <w:rPr>
+          <w:rFonts w:ascii="Times New Roman" w:eastAsia="Times New Roman" w:hAnsi="Times New Roman" w:cs="Times New Roman"/>
+          <w:color w:val="1F1F1F"/>
+          <w:sz w:val="26"/>
+          <w:szCs w:val="26"/>
+          <w:lang w:val="vi-VN" w:eastAsia="vi-VN"/>
+        </w:rPr>
+      </w:pPr>
+      <w:r>
+        <w:rPr>
+          <w:rFonts w:ascii="Times New Roman" w:eastAsia="Times New Roman" w:hAnsi="Times New Roman" w:cs="Times New Roman"/>
+          <w:color w:val="1F1F1F"/>
+          <w:sz w:val="26"/>
+          <w:szCs w:val="26"/>
+          <w:lang w:val="vi-VN" w:eastAsia="vi-VN"/>
+        </w:rPr>
+        <w:t xml:space="preserve">Đăng ký thông tin bệnh nhân </w:t>
+      </w:r>
+    </w:p>
+    <w:p>
+      <w:pPr>
+        <w:pStyle w:val="ListParagraph"/>
+        <w:numPr>
+          <w:ilvl w:val="1"/>
+          <w:numId w:val="27"/>
+        </w:numPr>
+        <w:spacing w:after="0" w:line="240" w:lineRule="auto"/>
+        <w:rPr>
+          <w:rFonts w:ascii="Times New Roman" w:eastAsia="Times New Roman" w:hAnsi="Times New Roman" w:cs="Times New Roman"/>
+          <w:color w:val="1F1F1F"/>
+          <w:sz w:val="26"/>
+          <w:szCs w:val="26"/>
+          <w:lang w:val="vi-VN" w:eastAsia="vi-VN"/>
+        </w:rPr>
+      </w:pPr>
+      <w:r>
+        <w:rPr>
+          <w:rFonts w:ascii="Times New Roman" w:eastAsia="Times New Roman" w:hAnsi="Times New Roman" w:cs="Times New Roman"/>
+          <w:color w:val="1F1F1F"/>
+          <w:sz w:val="26"/>
+          <w:szCs w:val="26"/>
+          <w:lang w:val="vi-VN" w:eastAsia="vi-VN"/>
+        </w:rPr>
+        <w:t xml:space="preserve">Cập nhật thông tin hành chính bệnh nhân </w:t>
+      </w:r>
+    </w:p>
+    <w:p>
+      <w:pPr>
+        <w:pStyle w:val="ListParagraph"/>
+        <w:numPr>
+          <w:ilvl w:val="1"/>
+          <w:numId w:val="27"/>
+        </w:numPr>
+        <w:spacing w:after="0" w:line="240" w:lineRule="auto"/>
+        <w:rPr>
+          <w:rFonts w:ascii="Times New Roman" w:eastAsia="Times New Roman" w:hAnsi="Times New Roman" w:cs="Times New Roman"/>
+          <w:color w:val="1F1F1F"/>
+          <w:sz w:val="26"/>
+          <w:szCs w:val="26"/>
+          <w:lang w:val="vi-VN" w:eastAsia="vi-VN"/>
+        </w:rPr>
+      </w:pPr>
+      <w:r>
+        <w:rPr>
+          <w:rFonts w:ascii="Times New Roman" w:eastAsia="Times New Roman" w:hAnsi="Times New Roman" w:cs="Times New Roman"/>
+          <w:color w:val="1F1F1F"/>
+          <w:sz w:val="26"/>
+          <w:szCs w:val="26"/>
+          <w:lang w:val="vi-VN" w:eastAsia="vi-VN"/>
+        </w:rPr>
+        <w:t xml:space="preserve">Tra cứu thông tin bệnh nhân </w:t>
+      </w:r>
+    </w:p>
+    <w:p>
+      <w:pPr>
+        <w:pStyle w:val="ListParagraph"/>
+        <w:numPr>
+          <w:ilvl w:val="1"/>
+          <w:numId w:val="27"/>
+        </w:numPr>
+        <w:spacing w:after="120" w:line="240" w:lineRule="auto"/>
+        <w:jc w:val="both"/>
+        <w:rPr>
+          <w:rFonts w:ascii="Times New Roman" w:hAnsi="Times New Roman" w:cs="Times New Roman"/>
+          <w:b/>
+          <w:sz w:val="26"/>
+          <w:szCs w:val="26"/>
+        </w:rPr>
+      </w:pPr>
+      <w:r>
+        <w:rPr>
+          <w:rFonts w:ascii="Times New Roman" w:hAnsi="Times New Roman" w:cs="Times New Roman"/>
+          <w:bCs/>
+          <w:sz w:val="26"/>
+          <w:szCs w:val="26"/>
+          <w:lang w:val="vi-VN"/>
+        </w:rPr>
+        <w:lastRenderedPageBreak/>
+        <w:t>Đặt lịch khám.</w:t>
+      </w:r>
+    </w:p>
+    <w:p>
+      <w:pPr>
+        <w:pStyle w:val="ListParagraph"/>
+        <w:numPr>
+          <w:ilvl w:val="1"/>
+          <w:numId w:val="27"/>
         </w:numPr>
         <w:spacing w:afterLines="120" w:after="288" w:line="240" w:lineRule="auto"/>
         <w:jc w:val="both"/>
@@ -6705,13 +6851,353 @@
       </w:pPr>
       <w:r>
         <w:rPr>
+          <w:rFonts w:ascii="Times New Roman" w:eastAsia="Times New Roman" w:hAnsi="Times New Roman" w:cs="Times New Roman"/>
+          <w:sz w:val="26"/>
+          <w:szCs w:val="26"/>
+        </w:rPr>
+        <w:t xml:space="preserve">Tạo lịch tái khám </w:t>
+      </w:r>
+    </w:p>
+    <w:p>
+      <w:pPr>
+        <w:pStyle w:val="ListParagraph"/>
+        <w:numPr>
+          <w:ilvl w:val="1"/>
+          <w:numId w:val="27"/>
+        </w:numPr>
+        <w:spacing w:after="120" w:line="240" w:lineRule="auto"/>
+        <w:jc w:val="both"/>
+        <w:rPr>
+          <w:rFonts w:ascii="Times New Roman" w:hAnsi="Times New Roman" w:cs="Times New Roman"/>
+          <w:b/>
+          <w:sz w:val="26"/>
+          <w:szCs w:val="26"/>
+        </w:rPr>
+      </w:pPr>
+      <w:r>
+        <w:rPr>
+          <w:rFonts w:ascii="Times New Roman" w:hAnsi="Times New Roman" w:cs="Times New Roman"/>
+          <w:bCs/>
+          <w:sz w:val="26"/>
+          <w:szCs w:val="26"/>
+          <w:lang w:val="vi-VN"/>
+        </w:rPr>
+        <w:t>Quản lý lịch hẹn.</w:t>
+      </w:r>
+    </w:p>
+    <w:p>
+      <w:pPr>
+        <w:pStyle w:val="ListParagraph"/>
+        <w:numPr>
+          <w:ilvl w:val="1"/>
+          <w:numId w:val="27"/>
+        </w:numPr>
+        <w:spacing w:after="120" w:line="240" w:lineRule="auto"/>
+        <w:jc w:val="both"/>
+        <w:rPr>
+          <w:rFonts w:ascii="Times New Roman" w:hAnsi="Times New Roman" w:cs="Times New Roman"/>
+          <w:b/>
+          <w:sz w:val="26"/>
+          <w:szCs w:val="26"/>
+        </w:rPr>
+      </w:pPr>
+      <w:r>
+        <w:rPr>
+          <w:rFonts w:ascii="Times New Roman" w:hAnsi="Times New Roman" w:cs="Times New Roman"/>
+          <w:bCs/>
+          <w:sz w:val="26"/>
+          <w:szCs w:val="26"/>
+        </w:rPr>
+        <w:t>Xác nhận lịch hẹn.</w:t>
+      </w:r>
+    </w:p>
+    <w:p>
+      <w:pPr>
+        <w:pStyle w:val="ListParagraph"/>
+        <w:numPr>
+          <w:ilvl w:val="1"/>
+          <w:numId w:val="27"/>
+        </w:numPr>
+        <w:spacing w:after="120" w:line="240" w:lineRule="auto"/>
+        <w:jc w:val="both"/>
+        <w:rPr>
+          <w:rFonts w:ascii="Times New Roman" w:hAnsi="Times New Roman" w:cs="Times New Roman"/>
+          <w:bCs/>
+          <w:sz w:val="26"/>
+          <w:szCs w:val="26"/>
+        </w:rPr>
+      </w:pPr>
+      <w:r>
+        <w:rPr>
+          <w:rFonts w:ascii="Times New Roman" w:hAnsi="Times New Roman" w:cs="Times New Roman"/>
+          <w:bCs/>
+          <w:sz w:val="26"/>
+          <w:szCs w:val="26"/>
+        </w:rPr>
+        <w:t>Hủy lịch hẹn.</w:t>
+      </w:r>
+    </w:p>
+    <w:p>
+      <w:pPr>
+        <w:pStyle w:val="ListParagraph"/>
+        <w:numPr>
+          <w:ilvl w:val="1"/>
+          <w:numId w:val="27"/>
+        </w:numPr>
+        <w:spacing w:after="120" w:line="240" w:lineRule="auto"/>
+        <w:jc w:val="both"/>
+        <w:rPr>
+          <w:rFonts w:ascii="Times New Roman" w:hAnsi="Times New Roman" w:cs="Times New Roman"/>
+          <w:b/>
+          <w:sz w:val="26"/>
+          <w:szCs w:val="26"/>
+        </w:rPr>
+      </w:pPr>
+      <w:r>
+        <w:rPr>
+          <w:rFonts w:ascii="Times New Roman" w:hAnsi="Times New Roman" w:cs="Times New Roman"/>
+          <w:bCs/>
+          <w:sz w:val="26"/>
+          <w:szCs w:val="26"/>
+          <w:lang w:val="vi-VN"/>
+        </w:rPr>
+        <w:t>Thay đổi lịch hẹn.</w:t>
+      </w:r>
+    </w:p>
+    <w:p>
+      <w:pPr>
+        <w:pStyle w:val="ListParagraph"/>
+        <w:numPr>
+          <w:ilvl w:val="1"/>
+          <w:numId w:val="27"/>
+        </w:numPr>
+        <w:spacing w:after="120" w:line="240" w:lineRule="auto"/>
+        <w:jc w:val="both"/>
+        <w:rPr>
+          <w:rFonts w:ascii="Times New Roman" w:hAnsi="Times New Roman" w:cs="Times New Roman"/>
+          <w:b/>
+          <w:sz w:val="26"/>
+          <w:szCs w:val="26"/>
+        </w:rPr>
+      </w:pPr>
+      <w:r>
+        <w:rPr>
+          <w:rFonts w:ascii="Times New Roman" w:hAnsi="Times New Roman" w:cs="Times New Roman"/>
+          <w:bCs/>
+          <w:sz w:val="26"/>
+          <w:szCs w:val="26"/>
+        </w:rPr>
+        <w:t>Xem</w:t>
+      </w:r>
+      <w:r>
+        <w:rPr>
+          <w:rFonts w:ascii="Times New Roman" w:hAnsi="Times New Roman" w:cs="Times New Roman"/>
+          <w:bCs/>
+          <w:sz w:val="26"/>
+          <w:szCs w:val="26"/>
+          <w:lang w:val="vi-VN"/>
+        </w:rPr>
+        <w:t xml:space="preserve"> và cập nhật hồ sơ bệnh nhân.</w:t>
+      </w:r>
+    </w:p>
+    <w:p>
+      <w:pPr>
+        <w:pStyle w:val="ListParagraph"/>
+        <w:numPr>
+          <w:ilvl w:val="1"/>
+          <w:numId w:val="27"/>
+        </w:numPr>
+        <w:spacing w:after="120" w:line="240" w:lineRule="auto"/>
+        <w:jc w:val="both"/>
+        <w:rPr>
+          <w:rFonts w:ascii="Times New Roman" w:hAnsi="Times New Roman" w:cs="Times New Roman"/>
+          <w:b/>
+          <w:sz w:val="26"/>
+          <w:szCs w:val="26"/>
+        </w:rPr>
+      </w:pPr>
+      <w:r>
+        <w:rPr>
+          <w:rFonts w:ascii="Times New Roman" w:hAnsi="Times New Roman" w:cs="Times New Roman"/>
+          <w:bCs/>
+          <w:sz w:val="26"/>
+          <w:szCs w:val="26"/>
+          <w:lang w:val="vi-VN"/>
+        </w:rPr>
+        <w:t>Theo dõi danh sách bệnh nhân.</w:t>
+      </w:r>
+    </w:p>
+    <w:p>
+      <w:pPr>
+        <w:pStyle w:val="ListParagraph"/>
+        <w:numPr>
+          <w:ilvl w:val="1"/>
+          <w:numId w:val="27"/>
+        </w:numPr>
+        <w:spacing w:after="120" w:line="240" w:lineRule="auto"/>
+        <w:jc w:val="both"/>
+        <w:rPr>
+          <w:rFonts w:ascii="Times New Roman" w:hAnsi="Times New Roman" w:cs="Times New Roman"/>
+          <w:bCs/>
+          <w:sz w:val="26"/>
+          <w:szCs w:val="26"/>
+        </w:rPr>
+      </w:pPr>
+      <w:r>
+        <w:rPr>
+          <w:rFonts w:ascii="Times New Roman" w:hAnsi="Times New Roman" w:cs="Times New Roman"/>
+          <w:bCs/>
+          <w:sz w:val="26"/>
+          <w:szCs w:val="26"/>
+        </w:rPr>
+        <w:t>Tiếp nhận và check-in bệnh nhân.</w:t>
+      </w:r>
+    </w:p>
+    <w:p>
+      <w:pPr>
+        <w:pStyle w:val="ListParagraph"/>
+        <w:spacing w:after="0" w:line="240" w:lineRule="auto"/>
+        <w:ind w:left="1800"/>
+        <w:rPr>
+          <w:rFonts w:ascii="Times New Roman" w:eastAsia="Times New Roman" w:hAnsi="Times New Roman" w:cs="Times New Roman"/>
+          <w:color w:val="1F1F1F"/>
+          <w:sz w:val="26"/>
+          <w:szCs w:val="26"/>
+          <w:lang w:val="vi-VN" w:eastAsia="vi-VN"/>
+        </w:rPr>
+      </w:pPr>
+    </w:p>
+    <w:p>
+      <w:pPr>
+        <w:pStyle w:val="ListParagraph"/>
+        <w:spacing w:afterLines="120" w:after="288" w:line="240" w:lineRule="auto"/>
+        <w:ind w:left="1440"/>
+        <w:jc w:val="both"/>
+        <w:rPr>
+          <w:rFonts w:ascii="Times New Roman" w:hAnsi="Times New Roman" w:cs="Times New Roman"/>
+          <w:b/>
+          <w:sz w:val="26"/>
+          <w:szCs w:val="26"/>
+        </w:rPr>
+      </w:pPr>
+    </w:p>
+    <w:p>
+      <w:pPr>
+        <w:pStyle w:val="ListParagraph"/>
+        <w:numPr>
+          <w:ilvl w:val="0"/>
+          <w:numId w:val="27"/>
+        </w:numPr>
+        <w:spacing w:afterLines="120" w:after="288" w:line="240" w:lineRule="auto"/>
+        <w:jc w:val="both"/>
+        <w:rPr>
           <w:rFonts w:ascii="Times New Roman" w:hAnsi="Times New Roman" w:cs="Times New Roman"/>
           <w:bCs/>
           <w:sz w:val="26"/>
           <w:szCs w:val="26"/>
           <w:u w:val="single"/>
         </w:rPr>
+      </w:pPr>
+      <w:r>
+        <w:rPr>
+          <w:rFonts w:ascii="Times New Roman" w:hAnsi="Times New Roman" w:cs="Times New Roman"/>
+          <w:bCs/>
+          <w:sz w:val="26"/>
+          <w:szCs w:val="26"/>
+          <w:u w:val="single"/>
+        </w:rPr>
         <w:t>Nha sĩ:</w:t>
+      </w:r>
+    </w:p>
+    <w:p>
+      <w:pPr>
+        <w:pStyle w:val="ListParagraph"/>
+        <w:numPr>
+          <w:ilvl w:val="1"/>
+          <w:numId w:val="27"/>
+        </w:numPr>
+        <w:spacing w:after="120" w:line="240" w:lineRule="auto"/>
+        <w:jc w:val="both"/>
+        <w:rPr>
+          <w:rFonts w:ascii="Times New Roman" w:hAnsi="Times New Roman" w:cs="Times New Roman"/>
+          <w:b/>
+          <w:sz w:val="26"/>
+          <w:szCs w:val="26"/>
+        </w:rPr>
+      </w:pPr>
+      <w:r>
+        <w:rPr>
+          <w:rFonts w:ascii="Times New Roman" w:hAnsi="Times New Roman" w:cs="Times New Roman"/>
+          <w:bCs/>
+          <w:sz w:val="26"/>
+          <w:szCs w:val="26"/>
+        </w:rPr>
+        <w:t>Đăng</w:t>
+      </w:r>
+      <w:r>
+        <w:rPr>
+          <w:rFonts w:ascii="Times New Roman" w:hAnsi="Times New Roman" w:cs="Times New Roman"/>
+          <w:bCs/>
+          <w:sz w:val="26"/>
+          <w:szCs w:val="26"/>
+          <w:lang w:val="vi-VN"/>
+        </w:rPr>
+        <w:t xml:space="preserve"> nhập.</w:t>
+      </w:r>
+    </w:p>
+    <w:p>
+      <w:pPr>
+        <w:pStyle w:val="ListParagraph"/>
+        <w:numPr>
+          <w:ilvl w:val="1"/>
+          <w:numId w:val="27"/>
+        </w:numPr>
+        <w:spacing w:after="120" w:line="240" w:lineRule="auto"/>
+        <w:jc w:val="both"/>
+        <w:rPr>
+          <w:rFonts w:ascii="Times New Roman" w:hAnsi="Times New Roman" w:cs="Times New Roman"/>
+          <w:bCs/>
+          <w:sz w:val="26"/>
+          <w:szCs w:val="26"/>
+          <w:lang w:val="vi-VN"/>
+        </w:rPr>
+      </w:pPr>
+      <w:r>
+        <w:rPr>
+          <w:rFonts w:ascii="Times New Roman" w:hAnsi="Times New Roman" w:cs="Times New Roman"/>
+          <w:bCs/>
+          <w:sz w:val="26"/>
+          <w:szCs w:val="26"/>
+          <w:lang w:val="vi-VN"/>
+        </w:rPr>
+        <w:t>Xem lịch làm việc.</w:t>
+      </w:r>
+    </w:p>
+    <w:p>
+      <w:pPr>
+        <w:pStyle w:val="ListParagraph"/>
+        <w:numPr>
+          <w:ilvl w:val="1"/>
+          <w:numId w:val="27"/>
+        </w:numPr>
+        <w:spacing w:afterLines="120" w:after="288" w:line="240" w:lineRule="auto"/>
+        <w:jc w:val="both"/>
+        <w:rPr>
+          <w:rFonts w:ascii="Times New Roman" w:hAnsi="Times New Roman" w:cs="Times New Roman"/>
+          <w:bCs/>
+          <w:sz w:val="26"/>
+          <w:szCs w:val="26"/>
+        </w:rPr>
+      </w:pPr>
+      <w:r>
+        <w:rPr>
+          <w:rFonts w:ascii="Times New Roman" w:eastAsia="Times New Roman" w:hAnsi="Times New Roman" w:cs="Times New Roman"/>
+          <w:color w:val="1F1F1F"/>
+          <w:sz w:val="26"/>
+          <w:szCs w:val="26"/>
+          <w:lang w:val="vi-VN" w:eastAsia="vi-VN"/>
+        </w:rPr>
+        <w:t>Tra cứu thông tin bệnh nhân</w:t>
       </w:r>
     </w:p>
     <w:p>
@@ -6737,7 +7223,7 @@
           <w:sz w:val="26"/>
           <w:szCs w:val="26"/>
         </w:rPr>
-        <w:t>Xem kế hoạch điều trị của bệnh nhân.</w:t>
+        <w:t>Xem hồ sơ và lịch sử điều trị của bệnh nhân.</w:t>
       </w:r>
     </w:p>
     <w:p>
@@ -6763,7 +7249,7 @@
           <w:sz w:val="26"/>
           <w:szCs w:val="26"/>
         </w:rPr>
-        <w:t>Tạo kế hoạch điều trị.</w:t>
+        <w:t>Cập nhật dữ liệu y khoa chuyên sâu.</w:t>
       </w:r>
     </w:p>
     <w:p>
@@ -6789,7 +7275,7 @@
           <w:sz w:val="26"/>
           <w:szCs w:val="26"/>
         </w:rPr>
-        <w:t>Xác định phương án điều trị.</w:t>
+        <w:t>Xem tình trạng và tiến độ điều trị hiện tại.</w:t>
       </w:r>
     </w:p>
     <w:p>
@@ -6815,7 +7301,7 @@
           <w:sz w:val="26"/>
           <w:szCs w:val="26"/>
         </w:rPr>
-        <w:t>Thêm dịch vụ vào kế hoạch điều trị.</w:t>
+        <w:t>Tạo kế hoạch điều trị.</w:t>
       </w:r>
     </w:p>
     <w:p>
@@ -6841,7 +7327,7 @@
           <w:sz w:val="26"/>
           <w:szCs w:val="26"/>
         </w:rPr>
-        <w:t>Phân chia dịch vụ theo từng buổi điều trị.</w:t>
+        <w:t>Xác định phương án điều trị.</w:t>
       </w:r>
     </w:p>
     <w:p>
@@ -6867,7 +7353,7 @@
           <w:sz w:val="26"/>
           <w:szCs w:val="26"/>
         </w:rPr>
-        <w:t>Xác nhận kế hoạch điều trị.</w:t>
+        <w:t>Thêm dịch vụ vào kế hoạch điều trị.</w:t>
       </w:r>
     </w:p>
     <w:p>
@@ -6893,7 +7379,7 @@
           <w:sz w:val="26"/>
           <w:szCs w:val="26"/>
         </w:rPr>
-        <w:t>Xem lịch sử điều trị của bệnh nhân.</w:t>
+        <w:t>Phân chia dịch vụ theo từng buổi điều trị.</w:t>
       </w:r>
     </w:p>
     <w:p>
@@ -6919,7 +7405,7 @@
           <w:sz w:val="26"/>
           <w:szCs w:val="26"/>
         </w:rPr>
-        <w:t>Xem tình trạng và tiến độ điều trị hiện tại.</w:t>
+        <w:t>Xác nhận kế hoạch điều trị.</w:t>
       </w:r>
     </w:p>
     <w:p>
@@ -6945,16 +7431,16 @@
           <w:sz w:val="26"/>
           <w:szCs w:val="26"/>
         </w:rPr>
-        <w:t>Cập nhật</w:t>
-      </w:r>
-      <w:r>
-        <w:rPr>
-          <w:rFonts w:ascii="Times New Roman" w:hAnsi="Times New Roman" w:cs="Times New Roman"/>
-          <w:bCs/>
-          <w:sz w:val="26"/>
-          <w:szCs w:val="26"/>
-        </w:rPr>
-        <w:t xml:space="preserve"> kết quả buổi điều trị.</w:t>
+        <w:t>Chỉnh sửa</w:t>
+      </w:r>
+      <w:r>
+        <w:rPr>
+          <w:rFonts w:ascii="Times New Roman" w:hAnsi="Times New Roman" w:cs="Times New Roman"/>
+          <w:bCs/>
+          <w:sz w:val="26"/>
+          <w:szCs w:val="26"/>
+        </w:rPr>
+        <w:t xml:space="preserve"> kế hoạch điều trị.</w:t>
       </w:r>
     </w:p>
     <w:p>
@@ -6980,16 +7466,7 @@
           <w:sz w:val="26"/>
           <w:szCs w:val="26"/>
         </w:rPr>
-        <w:t>Cập nhật</w:t>
-      </w:r>
-      <w:r>
-        <w:rPr>
-          <w:rFonts w:ascii="Times New Roman" w:hAnsi="Times New Roman" w:cs="Times New Roman"/>
-          <w:bCs/>
-          <w:sz w:val="26"/>
-          <w:szCs w:val="26"/>
-        </w:rPr>
-        <w:t xml:space="preserve"> các dịch vụ đã thực hiện.</w:t>
+        <w:t>Ghi nhận lý do điều chỉnh.</w:t>
       </w:r>
     </w:p>
     <w:p>
@@ -7015,16 +7492,7 @@
           <w:sz w:val="26"/>
           <w:szCs w:val="26"/>
         </w:rPr>
-        <w:t>Cập nhật</w:t>
-      </w:r>
-      <w:r>
-        <w:rPr>
-          <w:rFonts w:ascii="Times New Roman" w:hAnsi="Times New Roman" w:cs="Times New Roman"/>
-          <w:bCs/>
-          <w:sz w:val="26"/>
-          <w:szCs w:val="26"/>
-        </w:rPr>
-        <w:t xml:space="preserve"> tình trạng trước và sau điều trị.</w:t>
+        <w:t>Xác nhận kế hoạch điều trị sau điều chỉnh.</w:t>
       </w:r>
     </w:p>
     <w:p>
@@ -7050,7 +7518,7 @@
           <w:sz w:val="26"/>
           <w:szCs w:val="26"/>
         </w:rPr>
-        <w:t>Xác nhận hoàn tất buổi điều trị.</w:t>
+        <w:t>Xem chi tiết buổi điều trị.</w:t>
       </w:r>
     </w:p>
     <w:p>
@@ -7076,7 +7544,7 @@
           <w:sz w:val="26"/>
           <w:szCs w:val="26"/>
         </w:rPr>
-        <w:t>Điều chỉnh kế hoạch điều trị.</w:t>
+        <w:t>Cập nhật kết quả buổi điều trị.</w:t>
       </w:r>
     </w:p>
     <w:p>
@@ -7102,7 +7570,16 @@
           <w:sz w:val="26"/>
           <w:szCs w:val="26"/>
         </w:rPr>
-        <w:t>Ghi nhận lý do điều chỉnh kế hoạch.</w:t>
+        <w:t>Cập nhật</w:t>
+      </w:r>
+      <w:r>
+        <w:rPr>
+          <w:rFonts w:ascii="Times New Roman" w:hAnsi="Times New Roman" w:cs="Times New Roman"/>
+          <w:bCs/>
+          <w:sz w:val="26"/>
+          <w:szCs w:val="26"/>
+        </w:rPr>
+        <w:t xml:space="preserve"> các dịch vụ đã thực hiện.</w:t>
       </w:r>
     </w:p>
     <w:p>
@@ -7128,7 +7605,16 @@
           <w:sz w:val="26"/>
           <w:szCs w:val="26"/>
         </w:rPr>
-        <w:t>Xác nhận kế hoạch điều trị sau khi điều chỉnh.</w:t>
+        <w:t>Cập nhật</w:t>
+      </w:r>
+      <w:r>
+        <w:rPr>
+          <w:rFonts w:ascii="Times New Roman" w:hAnsi="Times New Roman" w:cs="Times New Roman"/>
+          <w:bCs/>
+          <w:sz w:val="26"/>
+          <w:szCs w:val="26"/>
+        </w:rPr>
+        <w:t xml:space="preserve"> tình trạng trước và sau điều trị.</w:t>
       </w:r>
     </w:p>
     <w:p>
@@ -7154,7 +7640,7 @@
           <w:sz w:val="26"/>
           <w:szCs w:val="26"/>
         </w:rPr>
-        <w:t>Đánh giá nhu cầu tái khám.</w:t>
+        <w:t>Xác nhận hoàn tất buổi điều trị.</w:t>
       </w:r>
     </w:p>
     <w:p>
@@ -7180,7 +7666,7 @@
           <w:sz w:val="26"/>
           <w:szCs w:val="26"/>
         </w:rPr>
-        <w:t>Xác định mục đích và thời gian tái khám.</w:t>
+        <w:t>Đánh giá nhu cầu tái khám.</w:t>
       </w:r>
     </w:p>
     <w:p>
@@ -7206,7 +7692,7 @@
           <w:sz w:val="26"/>
           <w:szCs w:val="26"/>
         </w:rPr>
-        <w:t>Xem kết quả các lần tái khám.</w:t>
+        <w:t>Xác định mục đích và thời gian tái khám.</w:t>
       </w:r>
     </w:p>
     <w:p>
@@ -7232,7 +7718,7 @@
           <w:sz w:val="26"/>
           <w:szCs w:val="26"/>
         </w:rPr>
-        <w:t>Ghi nhận kết quả tái khám.</w:t>
+        <w:t>Xem kết quả các lần tái khám.</w:t>
       </w:r>
     </w:p>
     <w:p>
@@ -7258,7 +7744,16 @@
           <w:sz w:val="26"/>
           <w:szCs w:val="26"/>
         </w:rPr>
-        <w:t>Xác định phương án xử lý sau tái khám.</w:t>
+        <w:t>Ghi nhận kết quả tái khám.</w:t>
+      </w:r>
+      <w:r>
+        <w:rPr>
+          <w:rFonts w:ascii="Times New Roman" w:hAnsi="Times New Roman" w:cs="Times New Roman"/>
+          <w:bCs/>
+          <w:sz w:val="26"/>
+          <w:szCs w:val="26"/>
+        </w:rPr>
+        <w:tab/>
       </w:r>
     </w:p>
     <w:p>
@@ -7284,7 +7779,7 @@
           <w:sz w:val="26"/>
           <w:szCs w:val="26"/>
         </w:rPr>
-        <w:t>Xác định dịch vụ hoặc buổi điều trị tiếp theo.</w:t>
+        <w:t>Xác định phương án xử lý sau tái khám.</w:t>
       </w:r>
     </w:p>
     <w:p>
@@ -7310,349 +7805,7 @@
           <w:sz w:val="26"/>
           <w:szCs w:val="26"/>
         </w:rPr>
-        <w:t>Xác nhận hoàn tất kế hoạch điều trị.</w:t>
-      </w:r>
-    </w:p>
-    <w:p>
-      <w:pPr>
-        <w:pStyle w:val="ListParagraph"/>
-        <w:spacing w:afterLines="120" w:after="288" w:line="240" w:lineRule="auto"/>
-        <w:ind w:left="1800"/>
-        <w:jc w:val="both"/>
-        <w:rPr>
-          <w:rFonts w:ascii="Times New Roman" w:hAnsi="Times New Roman" w:cs="Times New Roman"/>
-          <w:bCs/>
-          <w:sz w:val="26"/>
-          <w:szCs w:val="26"/>
-        </w:rPr>
-      </w:pPr>
-    </w:p>
-    <w:p>
-      <w:pPr>
-        <w:pStyle w:val="ListParagraph"/>
-        <w:numPr>
-          <w:ilvl w:val="0"/>
-          <w:numId w:val="14"/>
-        </w:numPr>
-        <w:spacing w:afterLines="120" w:after="288" w:line="240" w:lineRule="auto"/>
-        <w:jc w:val="both"/>
-        <w:rPr>
-          <w:rFonts w:ascii="Times New Roman" w:hAnsi="Times New Roman" w:cs="Times New Roman"/>
-          <w:bCs/>
-          <w:sz w:val="26"/>
-          <w:szCs w:val="26"/>
-          <w:u w:val="single"/>
-        </w:rPr>
-      </w:pPr>
-      <w:r>
-        <w:rPr>
-          <w:rFonts w:ascii="Times New Roman" w:hAnsi="Times New Roman" w:cs="Times New Roman"/>
-          <w:bCs/>
-          <w:sz w:val="26"/>
-          <w:szCs w:val="26"/>
-          <w:u w:val="single"/>
-        </w:rPr>
-        <w:t>Y tá:</w:t>
-      </w:r>
-    </w:p>
-    <w:p>
-      <w:pPr>
-        <w:pStyle w:val="ListParagraph"/>
-        <w:numPr>
-          <w:ilvl w:val="1"/>
-          <w:numId w:val="14"/>
-        </w:numPr>
-        <w:spacing w:after="0" w:line="240" w:lineRule="auto"/>
-        <w:rPr>
-          <w:rFonts w:ascii="Times New Roman" w:eastAsia="Times New Roman" w:hAnsi="Times New Roman" w:cs="Times New Roman"/>
-          <w:sz w:val="26"/>
-          <w:szCs w:val="26"/>
-        </w:rPr>
-      </w:pPr>
-      <w:r>
-        <w:rPr>
-          <w:rFonts w:ascii="Times New Roman" w:eastAsia="Times New Roman" w:hAnsi="Times New Roman" w:cs="Times New Roman"/>
-          <w:sz w:val="26"/>
-          <w:szCs w:val="26"/>
-        </w:rPr>
-        <w:t xml:space="preserve">Xem lịch phân công điều trị. </w:t>
-      </w:r>
-    </w:p>
-    <w:p>
-      <w:pPr>
-        <w:pStyle w:val="ListParagraph"/>
-        <w:numPr>
-          <w:ilvl w:val="1"/>
-          <w:numId w:val="14"/>
-        </w:numPr>
-        <w:spacing w:after="0" w:line="240" w:lineRule="auto"/>
-        <w:rPr>
-          <w:rFonts w:ascii="Times New Roman" w:eastAsia="Times New Roman" w:hAnsi="Times New Roman" w:cs="Times New Roman"/>
-          <w:sz w:val="26"/>
-          <w:szCs w:val="26"/>
-        </w:rPr>
-      </w:pPr>
-      <w:r>
-        <w:rPr>
-          <w:rFonts w:ascii="Times New Roman" w:eastAsia="Times New Roman" w:hAnsi="Times New Roman" w:cs="Times New Roman"/>
-          <w:sz w:val="26"/>
-          <w:szCs w:val="26"/>
-        </w:rPr>
-        <w:t xml:space="preserve">Xem lịch phân công tái khám. </w:t>
-      </w:r>
-    </w:p>
-    <w:p>
-      <w:pPr>
-        <w:pStyle w:val="ListParagraph"/>
-        <w:numPr>
-          <w:ilvl w:val="1"/>
-          <w:numId w:val="14"/>
-        </w:numPr>
-        <w:spacing w:after="0" w:line="240" w:lineRule="auto"/>
-        <w:rPr>
-          <w:rFonts w:ascii="Times New Roman" w:eastAsia="Times New Roman" w:hAnsi="Times New Roman" w:cs="Times New Roman"/>
-          <w:sz w:val="26"/>
-          <w:szCs w:val="26"/>
-        </w:rPr>
-      </w:pPr>
-      <w:r>
-        <w:rPr>
-          <w:rFonts w:ascii="Times New Roman" w:eastAsia="Times New Roman" w:hAnsi="Times New Roman" w:cs="Times New Roman"/>
-          <w:sz w:val="26"/>
-          <w:szCs w:val="26"/>
-        </w:rPr>
-        <w:t xml:space="preserve">Xem chi tiết buổi điều trị được phân công. </w:t>
-      </w:r>
-    </w:p>
-    <w:p>
-      <w:pPr>
-        <w:pStyle w:val="ListParagraph"/>
-        <w:numPr>
-          <w:ilvl w:val="1"/>
-          <w:numId w:val="14"/>
-        </w:numPr>
-        <w:spacing w:after="0" w:line="240" w:lineRule="auto"/>
-        <w:rPr>
-          <w:rFonts w:ascii="Times New Roman" w:eastAsia="Times New Roman" w:hAnsi="Times New Roman" w:cs="Times New Roman"/>
-          <w:sz w:val="26"/>
-          <w:szCs w:val="26"/>
-        </w:rPr>
-      </w:pPr>
-      <w:r>
-        <w:rPr>
-          <w:rFonts w:ascii="Times New Roman" w:eastAsia="Times New Roman" w:hAnsi="Times New Roman" w:cs="Times New Roman"/>
-          <w:sz w:val="26"/>
-          <w:szCs w:val="26"/>
-        </w:rPr>
-        <w:t xml:space="preserve">Xem chi tiết buổi tái khám được phân công. </w:t>
-      </w:r>
-    </w:p>
-    <w:p>
-      <w:pPr>
-        <w:pStyle w:val="ListParagraph"/>
-        <w:numPr>
-          <w:ilvl w:val="1"/>
-          <w:numId w:val="14"/>
-        </w:numPr>
-        <w:spacing w:after="0" w:line="240" w:lineRule="auto"/>
-        <w:rPr>
-          <w:rFonts w:ascii="Times New Roman" w:eastAsia="Times New Roman" w:hAnsi="Times New Roman" w:cs="Times New Roman"/>
-          <w:sz w:val="26"/>
-          <w:szCs w:val="26"/>
-        </w:rPr>
-      </w:pPr>
-      <w:r>
-        <w:rPr>
-          <w:rFonts w:ascii="Times New Roman" w:eastAsia="Times New Roman" w:hAnsi="Times New Roman" w:cs="Times New Roman"/>
-          <w:sz w:val="26"/>
-          <w:szCs w:val="26"/>
-        </w:rPr>
-        <w:t xml:space="preserve">Theo dõi thay đổi lịch phân công. </w:t>
-      </w:r>
-    </w:p>
-    <w:p>
-      <w:pPr>
-        <w:pStyle w:val="ListParagraph"/>
-        <w:numPr>
-          <w:ilvl w:val="1"/>
-          <w:numId w:val="14"/>
-        </w:numPr>
-        <w:spacing w:after="0" w:line="240" w:lineRule="auto"/>
-        <w:rPr>
-          <w:rFonts w:ascii="Times New Roman" w:eastAsia="Times New Roman" w:hAnsi="Times New Roman" w:cs="Times New Roman"/>
-          <w:sz w:val="26"/>
-          <w:szCs w:val="26"/>
-        </w:rPr>
-      </w:pPr>
-      <w:r>
-        <w:rPr>
-          <w:rFonts w:ascii="Times New Roman" w:eastAsia="Times New Roman" w:hAnsi="Times New Roman" w:cs="Times New Roman"/>
-          <w:sz w:val="26"/>
-          <w:szCs w:val="26"/>
-        </w:rPr>
-        <w:t xml:space="preserve">Xem nội dung điều trị và các dịch vụ dự kiến. </w:t>
-      </w:r>
-    </w:p>
-    <w:p>
-      <w:pPr>
-        <w:pStyle w:val="ListParagraph"/>
-        <w:numPr>
-          <w:ilvl w:val="1"/>
-          <w:numId w:val="14"/>
-        </w:numPr>
-        <w:spacing w:after="0" w:line="240" w:lineRule="auto"/>
-        <w:rPr>
-          <w:rFonts w:ascii="Times New Roman" w:eastAsia="Times New Roman" w:hAnsi="Times New Roman" w:cs="Times New Roman"/>
-          <w:sz w:val="26"/>
-          <w:szCs w:val="26"/>
-        </w:rPr>
-      </w:pPr>
-      <w:r>
-        <w:rPr>
-          <w:rFonts w:ascii="Times New Roman" w:eastAsia="Times New Roman" w:hAnsi="Times New Roman" w:cs="Times New Roman"/>
-          <w:sz w:val="26"/>
-          <w:szCs w:val="26"/>
-        </w:rPr>
-        <w:t xml:space="preserve">Xem yêu cầu chuẩn bị cho buổi điều trị. </w:t>
-      </w:r>
-    </w:p>
-    <w:p>
-      <w:pPr>
-        <w:pStyle w:val="ListParagraph"/>
-        <w:numPr>
-          <w:ilvl w:val="1"/>
-          <w:numId w:val="14"/>
-        </w:numPr>
-        <w:spacing w:after="0" w:line="240" w:lineRule="auto"/>
-        <w:rPr>
-          <w:rFonts w:ascii="Times New Roman" w:eastAsia="Times New Roman" w:hAnsi="Times New Roman" w:cs="Times New Roman"/>
-          <w:sz w:val="26"/>
-          <w:szCs w:val="26"/>
-        </w:rPr>
-      </w:pPr>
-      <w:r>
-        <w:rPr>
-          <w:rFonts w:ascii="Times New Roman" w:eastAsia="Times New Roman" w:hAnsi="Times New Roman" w:cs="Times New Roman"/>
-          <w:sz w:val="26"/>
-          <w:szCs w:val="26"/>
-        </w:rPr>
-        <w:t xml:space="preserve">Xem yêu cầu chuẩn bị cho buổi tái khám. </w:t>
-      </w:r>
-    </w:p>
-    <w:p>
-      <w:pPr>
-        <w:pStyle w:val="ListParagraph"/>
-        <w:numPr>
-          <w:ilvl w:val="1"/>
-          <w:numId w:val="14"/>
-        </w:numPr>
-        <w:spacing w:after="0" w:line="240" w:lineRule="auto"/>
-        <w:rPr>
-          <w:rFonts w:ascii="Times New Roman" w:eastAsia="Times New Roman" w:hAnsi="Times New Roman" w:cs="Times New Roman"/>
-          <w:sz w:val="26"/>
-          <w:szCs w:val="26"/>
-        </w:rPr>
-      </w:pPr>
-      <w:r>
-        <w:rPr>
-          <w:rFonts w:ascii="Times New Roman" w:eastAsia="Times New Roman" w:hAnsi="Times New Roman" w:cs="Times New Roman"/>
-          <w:sz w:val="26"/>
-          <w:szCs w:val="26"/>
-        </w:rPr>
-        <w:t xml:space="preserve">Hỗ trợ nha sĩ trong quá trình thực hiện điều trị. </w:t>
-      </w:r>
-    </w:p>
-    <w:p>
-      <w:pPr>
-        <w:pStyle w:val="ListParagraph"/>
-        <w:numPr>
-          <w:ilvl w:val="1"/>
-          <w:numId w:val="14"/>
-        </w:numPr>
-        <w:spacing w:after="0" w:line="240" w:lineRule="auto"/>
-        <w:rPr>
-          <w:rFonts w:ascii="Times New Roman" w:eastAsia="Times New Roman" w:hAnsi="Times New Roman" w:cs="Times New Roman"/>
-          <w:sz w:val="26"/>
-          <w:szCs w:val="26"/>
-        </w:rPr>
-      </w:pPr>
-      <w:r>
-        <w:rPr>
-          <w:rFonts w:ascii="Times New Roman" w:eastAsia="Times New Roman" w:hAnsi="Times New Roman" w:cs="Times New Roman"/>
-          <w:sz w:val="26"/>
-          <w:szCs w:val="26"/>
-        </w:rPr>
-        <w:t xml:space="preserve">Hỗ trợ nha sĩ trong quá trình tái khám. </w:t>
-      </w:r>
-    </w:p>
-    <w:p>
-      <w:pPr>
-        <w:pStyle w:val="ListParagraph"/>
-        <w:numPr>
-          <w:ilvl w:val="1"/>
-          <w:numId w:val="14"/>
-        </w:numPr>
-        <w:spacing w:after="0" w:line="240" w:lineRule="auto"/>
-        <w:rPr>
-          <w:rFonts w:ascii="Times New Roman" w:eastAsia="Times New Roman" w:hAnsi="Times New Roman" w:cs="Times New Roman"/>
-          <w:sz w:val="26"/>
-          <w:szCs w:val="26"/>
-        </w:rPr>
-      </w:pPr>
-      <w:r>
-        <w:rPr>
-          <w:rFonts w:ascii="Times New Roman" w:eastAsia="Times New Roman" w:hAnsi="Times New Roman" w:cs="Times New Roman"/>
-          <w:sz w:val="26"/>
-          <w:szCs w:val="26"/>
-        </w:rPr>
-        <w:t xml:space="preserve">Ghi nhận thông tin hỗ trợ trong phạm vi được phân quyền. </w:t>
-      </w:r>
-    </w:p>
-    <w:p>
-      <w:pPr>
-        <w:pStyle w:val="ListParagraph"/>
-        <w:numPr>
-          <w:ilvl w:val="1"/>
-          <w:numId w:val="14"/>
-        </w:numPr>
-        <w:spacing w:after="0" w:line="240" w:lineRule="auto"/>
-        <w:rPr>
-          <w:rFonts w:ascii="Times New Roman" w:eastAsia="Times New Roman" w:hAnsi="Times New Roman" w:cs="Times New Roman"/>
-          <w:sz w:val="26"/>
-          <w:szCs w:val="26"/>
-        </w:rPr>
-      </w:pPr>
-      <w:r>
-        <w:rPr>
-          <w:rFonts w:ascii="Times New Roman" w:eastAsia="Times New Roman" w:hAnsi="Times New Roman" w:cs="Times New Roman"/>
-          <w:sz w:val="26"/>
-          <w:szCs w:val="26"/>
-        </w:rPr>
-        <w:t xml:space="preserve">Theo dõi các buổi điều trị tiếp theo. </w:t>
-      </w:r>
-    </w:p>
-    <w:p>
-      <w:pPr>
-        <w:pStyle w:val="ListParagraph"/>
-        <w:numPr>
-          <w:ilvl w:val="1"/>
-          <w:numId w:val="14"/>
-        </w:numPr>
-        <w:spacing w:after="0" w:line="240" w:lineRule="auto"/>
-        <w:rPr>
-          <w:rFonts w:ascii="Times New Roman" w:eastAsia="Times New Roman" w:hAnsi="Times New Roman" w:cs="Times New Roman"/>
-          <w:sz w:val="26"/>
-          <w:szCs w:val="26"/>
-        </w:rPr>
-      </w:pPr>
-      <w:r>
-        <w:rPr>
-          <w:rFonts w:ascii="Times New Roman" w:eastAsia="Times New Roman" w:hAnsi="Times New Roman" w:cs="Times New Roman"/>
-          <w:sz w:val="26"/>
-          <w:szCs w:val="26"/>
-        </w:rPr>
-        <w:lastRenderedPageBreak/>
-        <w:t xml:space="preserve">Theo dõi các lịch tái khám tiếp theo. </w:t>
+        <w:t>Xác định dịch vụ hoặc buổi điều trị tiếp theo.</w:t>
       </w:r>
     </w:p>
     <w:p>
@@ -7669,16 +7822,386 @@
           <w:bCs/>
           <w:sz w:val="26"/>
           <w:szCs w:val="26"/>
+        </w:rPr>
+      </w:pPr>
+      <w:r>
+        <w:rPr>
+          <w:rFonts w:ascii="Times New Roman" w:hAnsi="Times New Roman" w:cs="Times New Roman"/>
+          <w:bCs/>
+          <w:sz w:val="26"/>
+          <w:szCs w:val="26"/>
+        </w:rPr>
+        <w:t>Xác nhận hoàn tất kế hoạch điều trị.</w:t>
+      </w:r>
+    </w:p>
+    <w:p>
+      <w:pPr>
+        <w:pStyle w:val="ListParagraph"/>
+        <w:spacing w:afterLines="120" w:after="288" w:line="240" w:lineRule="auto"/>
+        <w:ind w:left="1800"/>
+        <w:jc w:val="both"/>
+        <w:rPr>
+          <w:rFonts w:ascii="Times New Roman" w:hAnsi="Times New Roman" w:cs="Times New Roman"/>
+          <w:bCs/>
+          <w:sz w:val="26"/>
+          <w:szCs w:val="26"/>
+        </w:rPr>
+      </w:pPr>
+    </w:p>
+    <w:p>
+      <w:pPr>
+        <w:pStyle w:val="ListParagraph"/>
+        <w:numPr>
+          <w:ilvl w:val="0"/>
+          <w:numId w:val="28"/>
+        </w:numPr>
+        <w:spacing w:afterLines="120" w:after="288" w:line="240" w:lineRule="auto"/>
+        <w:jc w:val="both"/>
+        <w:rPr>
+          <w:rFonts w:ascii="Times New Roman" w:hAnsi="Times New Roman" w:cs="Times New Roman"/>
+          <w:bCs/>
+          <w:sz w:val="26"/>
+          <w:szCs w:val="26"/>
           <w:u w:val="single"/>
         </w:rPr>
       </w:pPr>
       <w:r>
         <w:rPr>
-          <w:rFonts w:ascii="Times New Roman" w:eastAsia="Times New Roman" w:hAnsi="Times New Roman" w:cs="Times New Roman"/>
-          <w:sz w:val="26"/>
-          <w:szCs w:val="26"/>
-        </w:rPr>
-        <w:t>Tạo lịch tái khám theo chỉ định của nha sĩ.</w:t>
+          <w:rFonts w:ascii="Times New Roman" w:hAnsi="Times New Roman" w:cs="Times New Roman"/>
+          <w:bCs/>
+          <w:sz w:val="26"/>
+          <w:szCs w:val="26"/>
+          <w:u w:val="single"/>
+        </w:rPr>
+        <w:t>Y tá:</w:t>
+      </w:r>
+    </w:p>
+    <w:p>
+      <w:pPr>
+        <w:pStyle w:val="ListParagraph"/>
+        <w:numPr>
+          <w:ilvl w:val="1"/>
+          <w:numId w:val="28"/>
+        </w:numPr>
+        <w:spacing w:afterLines="120" w:after="288" w:line="240" w:lineRule="auto"/>
+        <w:jc w:val="both"/>
+        <w:rPr>
+          <w:rFonts w:ascii="Times New Roman" w:hAnsi="Times New Roman" w:cs="Times New Roman"/>
+          <w:bCs/>
+          <w:sz w:val="26"/>
+          <w:szCs w:val="26"/>
+          <w:u w:val="single"/>
+        </w:rPr>
+      </w:pPr>
+      <w:r>
+        <w:rPr>
+          <w:rFonts w:ascii="Times New Roman" w:hAnsi="Times New Roman" w:cs="Times New Roman"/>
+          <w:bCs/>
+          <w:sz w:val="26"/>
+          <w:szCs w:val="26"/>
+        </w:rPr>
+        <w:t>Đăng nhập</w:t>
+      </w:r>
+    </w:p>
+    <w:p>
+      <w:pPr>
+        <w:pStyle w:val="ListParagraph"/>
+        <w:numPr>
+          <w:ilvl w:val="1"/>
+          <w:numId w:val="14"/>
+        </w:numPr>
+        <w:spacing w:after="0" w:line="240" w:lineRule="auto"/>
+        <w:rPr>
+          <w:rFonts w:ascii="Times New Roman" w:eastAsia="Times New Roman" w:hAnsi="Times New Roman" w:cs="Times New Roman"/>
+          <w:sz w:val="26"/>
+          <w:szCs w:val="26"/>
+        </w:rPr>
+      </w:pPr>
+      <w:r>
+        <w:rPr>
+          <w:rFonts w:ascii="Times New Roman" w:eastAsia="Times New Roman" w:hAnsi="Times New Roman" w:cs="Times New Roman"/>
+          <w:sz w:val="26"/>
+          <w:szCs w:val="26"/>
+        </w:rPr>
+        <w:t xml:space="preserve">Xem lịch phân công điều trị. </w:t>
+      </w:r>
+    </w:p>
+    <w:p>
+      <w:pPr>
+        <w:pStyle w:val="ListParagraph"/>
+        <w:numPr>
+          <w:ilvl w:val="1"/>
+          <w:numId w:val="14"/>
+        </w:numPr>
+        <w:spacing w:after="0" w:line="240" w:lineRule="auto"/>
+        <w:rPr>
+          <w:rFonts w:ascii="Times New Roman" w:eastAsia="Times New Roman" w:hAnsi="Times New Roman" w:cs="Times New Roman"/>
+          <w:sz w:val="26"/>
+          <w:szCs w:val="26"/>
+        </w:rPr>
+      </w:pPr>
+      <w:r>
+        <w:rPr>
+          <w:rFonts w:ascii="Times New Roman" w:eastAsia="Times New Roman" w:hAnsi="Times New Roman" w:cs="Times New Roman"/>
+          <w:sz w:val="26"/>
+          <w:szCs w:val="26"/>
+        </w:rPr>
+        <w:lastRenderedPageBreak/>
+        <w:t xml:space="preserve">Xem lịch phân công tái khám. </w:t>
+      </w:r>
+    </w:p>
+    <w:p>
+      <w:pPr>
+        <w:pStyle w:val="ListParagraph"/>
+        <w:numPr>
+          <w:ilvl w:val="1"/>
+          <w:numId w:val="14"/>
+        </w:numPr>
+        <w:spacing w:after="0" w:line="240" w:lineRule="auto"/>
+        <w:rPr>
+          <w:rFonts w:ascii="Times New Roman" w:eastAsia="Times New Roman" w:hAnsi="Times New Roman" w:cs="Times New Roman"/>
+          <w:sz w:val="26"/>
+          <w:szCs w:val="26"/>
+        </w:rPr>
+      </w:pPr>
+      <w:r>
+        <w:rPr>
+          <w:rFonts w:ascii="Times New Roman" w:eastAsia="Times New Roman" w:hAnsi="Times New Roman" w:cs="Times New Roman"/>
+          <w:sz w:val="26"/>
+          <w:szCs w:val="26"/>
+        </w:rPr>
+        <w:t xml:space="preserve">Xem chi tiết buổi điều trị được phân công. </w:t>
+      </w:r>
+    </w:p>
+    <w:p>
+      <w:pPr>
+        <w:pStyle w:val="ListParagraph"/>
+        <w:numPr>
+          <w:ilvl w:val="1"/>
+          <w:numId w:val="14"/>
+        </w:numPr>
+        <w:spacing w:after="0" w:line="240" w:lineRule="auto"/>
+        <w:rPr>
+          <w:rFonts w:ascii="Times New Roman" w:eastAsia="Times New Roman" w:hAnsi="Times New Roman" w:cs="Times New Roman"/>
+          <w:sz w:val="26"/>
+          <w:szCs w:val="26"/>
+        </w:rPr>
+      </w:pPr>
+      <w:r>
+        <w:rPr>
+          <w:rFonts w:ascii="Times New Roman" w:eastAsia="Times New Roman" w:hAnsi="Times New Roman" w:cs="Times New Roman"/>
+          <w:sz w:val="26"/>
+          <w:szCs w:val="26"/>
+        </w:rPr>
+        <w:t xml:space="preserve">Xem chi tiết buổi tái khám được phân công. </w:t>
+      </w:r>
+    </w:p>
+    <w:p>
+      <w:pPr>
+        <w:pStyle w:val="ListParagraph"/>
+        <w:numPr>
+          <w:ilvl w:val="1"/>
+          <w:numId w:val="14"/>
+        </w:numPr>
+        <w:spacing w:after="0" w:line="240" w:lineRule="auto"/>
+        <w:rPr>
+          <w:rFonts w:ascii="Times New Roman" w:eastAsia="Times New Roman" w:hAnsi="Times New Roman" w:cs="Times New Roman"/>
+          <w:sz w:val="26"/>
+          <w:szCs w:val="26"/>
+        </w:rPr>
+      </w:pPr>
+      <w:r>
+        <w:rPr>
+          <w:rFonts w:ascii="Times New Roman" w:eastAsia="Times New Roman" w:hAnsi="Times New Roman" w:cs="Times New Roman"/>
+          <w:sz w:val="26"/>
+          <w:szCs w:val="26"/>
+        </w:rPr>
+        <w:t>Xem</w:t>
+      </w:r>
+      <w:r>
+        <w:rPr>
+          <w:rFonts w:ascii="Times New Roman" w:eastAsia="Times New Roman" w:hAnsi="Times New Roman" w:cs="Times New Roman"/>
+          <w:sz w:val="26"/>
+          <w:szCs w:val="26"/>
+        </w:rPr>
+        <w:t xml:space="preserve"> thay đổi lịch phân công. </w:t>
+      </w:r>
+    </w:p>
+    <w:p>
+      <w:pPr>
+        <w:pStyle w:val="ListParagraph"/>
+        <w:numPr>
+          <w:ilvl w:val="1"/>
+          <w:numId w:val="14"/>
+        </w:numPr>
+        <w:spacing w:after="0" w:line="240" w:lineRule="auto"/>
+        <w:rPr>
+          <w:rFonts w:ascii="Times New Roman" w:eastAsia="Times New Roman" w:hAnsi="Times New Roman" w:cs="Times New Roman"/>
+          <w:sz w:val="26"/>
+          <w:szCs w:val="26"/>
+        </w:rPr>
+      </w:pPr>
+      <w:r>
+        <w:rPr>
+          <w:rFonts w:ascii="Times New Roman" w:eastAsia="Times New Roman" w:hAnsi="Times New Roman" w:cs="Times New Roman"/>
+          <w:sz w:val="26"/>
+          <w:szCs w:val="26"/>
+        </w:rPr>
+        <w:t xml:space="preserve">Xem nội dung điều trị và các dịch vụ dự kiến. </w:t>
+      </w:r>
+    </w:p>
+    <w:p>
+      <w:pPr>
+        <w:pStyle w:val="ListParagraph"/>
+        <w:numPr>
+          <w:ilvl w:val="1"/>
+          <w:numId w:val="14"/>
+        </w:numPr>
+        <w:spacing w:after="0" w:line="240" w:lineRule="auto"/>
+        <w:rPr>
+          <w:rFonts w:ascii="Times New Roman" w:eastAsia="Times New Roman" w:hAnsi="Times New Roman" w:cs="Times New Roman"/>
+          <w:sz w:val="26"/>
+          <w:szCs w:val="26"/>
+        </w:rPr>
+      </w:pPr>
+      <w:r>
+        <w:rPr>
+          <w:rFonts w:ascii="Times New Roman" w:eastAsia="Times New Roman" w:hAnsi="Times New Roman" w:cs="Times New Roman"/>
+          <w:sz w:val="26"/>
+          <w:szCs w:val="26"/>
+        </w:rPr>
+        <w:t xml:space="preserve">Xem yêu cầu chuẩn bị cho buổi điều trị. </w:t>
+      </w:r>
+    </w:p>
+    <w:p>
+      <w:pPr>
+        <w:pStyle w:val="ListParagraph"/>
+        <w:numPr>
+          <w:ilvl w:val="1"/>
+          <w:numId w:val="14"/>
+        </w:numPr>
+        <w:spacing w:after="0" w:line="240" w:lineRule="auto"/>
+        <w:rPr>
+          <w:rFonts w:ascii="Times New Roman" w:eastAsia="Times New Roman" w:hAnsi="Times New Roman" w:cs="Times New Roman"/>
+          <w:sz w:val="26"/>
+          <w:szCs w:val="26"/>
+        </w:rPr>
+      </w:pPr>
+      <w:r>
+        <w:rPr>
+          <w:rFonts w:ascii="Times New Roman" w:eastAsia="Times New Roman" w:hAnsi="Times New Roman" w:cs="Times New Roman"/>
+          <w:sz w:val="26"/>
+          <w:szCs w:val="26"/>
+        </w:rPr>
+        <w:t xml:space="preserve">Xem yêu cầu chuẩn bị cho buổi tái khám. </w:t>
+      </w:r>
+    </w:p>
+    <w:p>
+      <w:pPr>
+        <w:pStyle w:val="ListParagraph"/>
+        <w:numPr>
+          <w:ilvl w:val="1"/>
+          <w:numId w:val="14"/>
+        </w:numPr>
+        <w:spacing w:after="0" w:line="240" w:lineRule="auto"/>
+        <w:rPr>
+          <w:rFonts w:ascii="Times New Roman" w:eastAsia="Times New Roman" w:hAnsi="Times New Roman" w:cs="Times New Roman"/>
+          <w:sz w:val="26"/>
+          <w:szCs w:val="26"/>
+        </w:rPr>
+      </w:pPr>
+      <w:r>
+        <w:rPr>
+          <w:rFonts w:ascii="Times New Roman" w:eastAsia="Times New Roman" w:hAnsi="Times New Roman" w:cs="Times New Roman"/>
+          <w:sz w:val="26"/>
+          <w:szCs w:val="26"/>
+        </w:rPr>
+        <w:t>Ghi nhận tình trạng chuẩn bị cho buổi điều trị.</w:t>
+      </w:r>
+    </w:p>
+    <w:p>
+      <w:pPr>
+        <w:pStyle w:val="ListParagraph"/>
+        <w:numPr>
+          <w:ilvl w:val="1"/>
+          <w:numId w:val="14"/>
+        </w:numPr>
+        <w:spacing w:after="0" w:line="240" w:lineRule="auto"/>
+        <w:rPr>
+          <w:rFonts w:ascii="Times New Roman" w:eastAsia="Times New Roman" w:hAnsi="Times New Roman" w:cs="Times New Roman"/>
+          <w:sz w:val="26"/>
+          <w:szCs w:val="26"/>
+        </w:rPr>
+      </w:pPr>
+      <w:r>
+        <w:rPr>
+          <w:rFonts w:ascii="Times New Roman" w:eastAsia="Times New Roman" w:hAnsi="Times New Roman" w:cs="Times New Roman"/>
+          <w:sz w:val="26"/>
+          <w:szCs w:val="26"/>
+        </w:rPr>
+        <w:t>Ghi nhận tình trạng chuẩn bị cho buổi tái khám.</w:t>
+      </w:r>
+    </w:p>
+    <w:p>
+      <w:pPr>
+        <w:pStyle w:val="ListParagraph"/>
+        <w:numPr>
+          <w:ilvl w:val="1"/>
+          <w:numId w:val="14"/>
+        </w:numPr>
+        <w:spacing w:after="0" w:line="240" w:lineRule="auto"/>
+        <w:rPr>
+          <w:rFonts w:ascii="Times New Roman" w:eastAsia="Times New Roman" w:hAnsi="Times New Roman" w:cs="Times New Roman"/>
+          <w:sz w:val="26"/>
+          <w:szCs w:val="26"/>
+        </w:rPr>
+      </w:pPr>
+      <w:r>
+        <w:rPr>
+          <w:rFonts w:ascii="Times New Roman" w:eastAsia="Times New Roman" w:hAnsi="Times New Roman" w:cs="Times New Roman"/>
+          <w:sz w:val="26"/>
+          <w:szCs w:val="26"/>
+        </w:rPr>
+        <w:t>Xem</w:t>
+      </w:r>
+      <w:r>
+        <w:rPr>
+          <w:rFonts w:ascii="Times New Roman" w:eastAsia="Times New Roman" w:hAnsi="Times New Roman" w:cs="Times New Roman"/>
+          <w:sz w:val="26"/>
+          <w:szCs w:val="26"/>
+        </w:rPr>
+        <w:t xml:space="preserve"> các buổi điều trị tiếp theo. </w:t>
+      </w:r>
+    </w:p>
+    <w:p>
+      <w:pPr>
+        <w:pStyle w:val="ListParagraph"/>
+        <w:numPr>
+          <w:ilvl w:val="1"/>
+          <w:numId w:val="14"/>
+        </w:numPr>
+        <w:spacing w:after="0" w:line="240" w:lineRule="auto"/>
+        <w:rPr>
+          <w:rFonts w:ascii="Times New Roman" w:eastAsia="Times New Roman" w:hAnsi="Times New Roman" w:cs="Times New Roman"/>
+          <w:sz w:val="26"/>
+          <w:szCs w:val="26"/>
+        </w:rPr>
+      </w:pPr>
+      <w:r>
+        <w:rPr>
+          <w:rFonts w:ascii="Times New Roman" w:eastAsia="Times New Roman" w:hAnsi="Times New Roman" w:cs="Times New Roman"/>
+          <w:sz w:val="26"/>
+          <w:szCs w:val="26"/>
+        </w:rPr>
+        <w:t>Xem</w:t>
+      </w:r>
+      <w:r>
+        <w:rPr>
+          <w:rFonts w:ascii="Times New Roman" w:eastAsia="Times New Roman" w:hAnsi="Times New Roman" w:cs="Times New Roman"/>
+          <w:sz w:val="26"/>
+          <w:szCs w:val="26"/>
+        </w:rPr>
+        <w:t xml:space="preserve"> các lịch tái khám tiếp theo. </w:t>
       </w:r>
     </w:p>
     <w:p>
@@ -8095,6 +8618,7 @@
           <w:sz w:val="26"/>
           <w:szCs w:val="26"/>
         </w:rPr>
+        <w:lastRenderedPageBreak/>
         <w:tab/>
       </w:r>
     </w:p>
@@ -8172,7 +8696,6 @@
           <w:sz w:val="26"/>
           <w:szCs w:val="26"/>
         </w:rPr>
-        <w:lastRenderedPageBreak/>
         <w:tab/>
       </w:r>
     </w:p>
@@ -8750,7 +9273,7 @@
         <v:path o:extrusionok="f" gradientshapeok="t" o:connecttype="rect"/>
         <o:lock v:ext="edit" aspectratio="t"/>
       </v:shapetype>
-      <v:shape id="_x0000_i1025" type="#_x0000_t75" style="width:11.15pt;height:11.15pt" o:bullet="t">
+      <v:shape id="_x0000_i1025" type="#_x0000_t75" style="width:11pt;height:11pt" o:bullet="t">
         <v:imagedata r:id="rId1" o:title="mso5725"/>
       </v:shape>
     </w:pict>
@@ -10198,6 +10721,119 @@
     </w:lvl>
   </w:abstractNum>
   <w:abstractNum w:abstractNumId="13" w15:restartNumberingAfterBreak="0">
+    <w:nsid w:val="46A162C2"/>
+    <w:multiLevelType w:val="hybridMultilevel"/>
+    <w:tmpl w:val="3FC60F02"/>
+    <w:lvl w:ilvl="0" w:tplc="394EDC3C">
+      <w:start w:val="1"/>
+      <w:numFmt w:val="bullet"/>
+      <w:lvlText w:val=""/>
+      <w:lvlJc w:val="center"/>
+      <w:pPr>
+        <w:ind w:left="1080" w:hanging="360"/>
+      </w:pPr>
+      <w:rPr>
+        <w:rFonts w:ascii="Symbol" w:hAnsi="Symbol" w:hint="default"/>
+      </w:rPr>
+    </w:lvl>
+    <w:lvl w:ilvl="1" w:tplc="04090003">
+      <w:start w:val="1"/>
+      <w:numFmt w:val="bullet"/>
+      <w:lvlText w:val="o"/>
+      <w:lvlJc w:val="left"/>
+      <w:pPr>
+        <w:ind w:left="1800" w:hanging="360"/>
+      </w:pPr>
+      <w:rPr>
+        <w:rFonts w:ascii="Courier New" w:hAnsi="Courier New" w:cs="Courier New" w:hint="default"/>
+      </w:rPr>
+    </w:lvl>
+    <w:lvl w:ilvl="2" w:tplc="04090005" w:tentative="1">
+      <w:start w:val="1"/>
+      <w:numFmt w:val="bullet"/>
+      <w:lvlText w:val=""/>
+      <w:lvlJc w:val="left"/>
+      <w:pPr>
+        <w:ind w:left="2520" w:hanging="360"/>
+      </w:pPr>
+      <w:rPr>
+        <w:rFonts w:ascii="Wingdings" w:hAnsi="Wingdings" w:hint="default"/>
+      </w:rPr>
+    </w:lvl>
+    <w:lvl w:ilvl="3" w:tplc="04090001" w:tentative="1">
+      <w:start w:val="1"/>
+      <w:numFmt w:val="bullet"/>
+      <w:lvlText w:val=""/>
+      <w:lvlJc w:val="left"/>
+      <w:pPr>
+        <w:ind w:left="3240" w:hanging="360"/>
+      </w:pPr>
+      <w:rPr>
+        <w:rFonts w:ascii="Symbol" w:hAnsi="Symbol" w:hint="default"/>
+      </w:rPr>
+    </w:lvl>
+    <w:lvl w:ilvl="4" w:tplc="04090003" w:tentative="1">
+      <w:start w:val="1"/>
+      <w:numFmt w:val="bullet"/>
+      <w:lvlText w:val="o"/>
+      <w:lvlJc w:val="left"/>
+      <w:pPr>
+        <w:ind w:left="3960" w:hanging="360"/>
+      </w:pPr>
+      <w:rPr>
+        <w:rFonts w:ascii="Courier New" w:hAnsi="Courier New" w:cs="Courier New" w:hint="default"/>
+      </w:rPr>
+    </w:lvl>
+    <w:lvl w:ilvl="5" w:tplc="04090005" w:tentative="1">
+      <w:start w:val="1"/>
+      <w:numFmt w:val="bullet"/>
+      <w:lvlText w:val=""/>
+      <w:lvlJc w:val="left"/>
+      <w:pPr>
+        <w:ind w:left="4680" w:hanging="360"/>
+      </w:pPr>
+      <w:rPr>
+        <w:rFonts w:ascii="Wingdings" w:hAnsi="Wingdings" w:hint="default"/>
+      </w:rPr>
+    </w:lvl>
+    <w:lvl w:ilvl="6" w:tplc="04090001" w:tentative="1">
+      <w:start w:val="1"/>
+      <w:numFmt w:val="bullet"/>
+      <w:lvlText w:val=""/>
+      <w:lvlJc w:val="left"/>
+      <w:pPr>
+        <w:ind w:left="5400" w:hanging="360"/>
+      </w:pPr>
+      <w:rPr>
+        <w:rFonts w:ascii="Symbol" w:hAnsi="Symbol" w:hint="default"/>
+      </w:rPr>
+    </w:lvl>
+    <w:lvl w:ilvl="7" w:tplc="04090003" w:tentative="1">
+      <w:start w:val="1"/>
+      <w:numFmt w:val="bullet"/>
+      <w:lvlText w:val="o"/>
+      <w:lvlJc w:val="left"/>
+      <w:pPr>
+        <w:ind w:left="6120" w:hanging="360"/>
+      </w:pPr>
+      <w:rPr>
+        <w:rFonts w:ascii="Courier New" w:hAnsi="Courier New" w:cs="Courier New" w:hint="default"/>
+      </w:rPr>
+    </w:lvl>
+    <w:lvl w:ilvl="8" w:tplc="04090005" w:tentative="1">
+      <w:start w:val="1"/>
+      <w:numFmt w:val="bullet"/>
+      <w:lvlText w:val=""/>
+      <w:lvlJc w:val="left"/>
+      <w:pPr>
+        <w:ind w:left="6840" w:hanging="360"/>
+      </w:pPr>
+      <w:rPr>
+        <w:rFonts w:ascii="Wingdings" w:hAnsi="Wingdings" w:hint="default"/>
+      </w:rPr>
+    </w:lvl>
+  </w:abstractNum>
+  <w:abstractNum w:abstractNumId="14" w15:restartNumberingAfterBreak="0">
     <w:nsid w:val="52C3509E"/>
     <w:multiLevelType w:val="hybridMultilevel"/>
     <w:tmpl w:val="57408BEE"/>
@@ -10310,7 +10946,7 @@
       </w:rPr>
     </w:lvl>
   </w:abstractNum>
-  <w:abstractNum w:abstractNumId="14" w15:restartNumberingAfterBreak="0">
+  <w:abstractNum w:abstractNumId="15" w15:restartNumberingAfterBreak="0">
     <w:nsid w:val="53FD5395"/>
     <w:multiLevelType w:val="hybridMultilevel"/>
     <w:tmpl w:val="F13E80CC"/>
@@ -10399,7 +11035,7 @@
       </w:pPr>
     </w:lvl>
   </w:abstractNum>
-  <w:abstractNum w:abstractNumId="15" w15:restartNumberingAfterBreak="0">
+  <w:abstractNum w:abstractNumId="16" w15:restartNumberingAfterBreak="0">
     <w:nsid w:val="58F04543"/>
     <w:multiLevelType w:val="hybridMultilevel"/>
     <w:tmpl w:val="DE0297C6"/>
@@ -10512,7 +11148,7 @@
       </w:rPr>
     </w:lvl>
   </w:abstractNum>
-  <w:abstractNum w:abstractNumId="16" w15:restartNumberingAfterBreak="0">
+  <w:abstractNum w:abstractNumId="17" w15:restartNumberingAfterBreak="0">
     <w:nsid w:val="59FD1723"/>
     <w:multiLevelType w:val="hybridMultilevel"/>
     <w:tmpl w:val="8990CF0E"/>
@@ -10652,7 +11288,7 @@
       </w:rPr>
     </w:lvl>
   </w:abstractNum>
-  <w:abstractNum w:abstractNumId="17" w15:restartNumberingAfterBreak="0">
+  <w:abstractNum w:abstractNumId="18" w15:restartNumberingAfterBreak="0">
     <w:nsid w:val="60F1451F"/>
     <w:multiLevelType w:val="hybridMultilevel"/>
     <w:tmpl w:val="96E4404C"/>
@@ -10741,7 +11377,233 @@
       </w:pPr>
     </w:lvl>
   </w:abstractNum>
-  <w:abstractNum w:abstractNumId="18" w15:restartNumberingAfterBreak="0">
+  <w:abstractNum w:abstractNumId="19" w15:restartNumberingAfterBreak="0">
+    <w:nsid w:val="632B4361"/>
+    <w:multiLevelType w:val="hybridMultilevel"/>
+    <w:tmpl w:val="1E94682E"/>
+    <w:lvl w:ilvl="0" w:tplc="394EDC3C">
+      <w:start w:val="1"/>
+      <w:numFmt w:val="bullet"/>
+      <w:lvlText w:val=""/>
+      <w:lvlJc w:val="center"/>
+      <w:pPr>
+        <w:ind w:left="1440" w:hanging="360"/>
+      </w:pPr>
+      <w:rPr>
+        <w:rFonts w:ascii="Symbol" w:hAnsi="Symbol" w:hint="default"/>
+      </w:rPr>
+    </w:lvl>
+    <w:lvl w:ilvl="1" w:tplc="4168AE56">
+      <w:start w:val="1"/>
+      <w:numFmt w:val="bullet"/>
+      <w:lvlText w:val=""/>
+      <w:lvlJc w:val="left"/>
+      <w:pPr>
+        <w:ind w:left="1800" w:hanging="360"/>
+      </w:pPr>
+      <w:rPr>
+        <w:rFonts w:ascii="Symbol" w:hAnsi="Symbol" w:hint="default"/>
+      </w:rPr>
+    </w:lvl>
+    <w:lvl w:ilvl="2" w:tplc="04090005" w:tentative="1">
+      <w:start w:val="1"/>
+      <w:numFmt w:val="bullet"/>
+      <w:lvlText w:val=""/>
+      <w:lvlJc w:val="left"/>
+      <w:pPr>
+        <w:ind w:left="2880" w:hanging="360"/>
+      </w:pPr>
+      <w:rPr>
+        <w:rFonts w:ascii="Wingdings" w:hAnsi="Wingdings" w:hint="default"/>
+      </w:rPr>
+    </w:lvl>
+    <w:lvl w:ilvl="3" w:tplc="04090001" w:tentative="1">
+      <w:start w:val="1"/>
+      <w:numFmt w:val="bullet"/>
+      <w:lvlText w:val=""/>
+      <w:lvlJc w:val="left"/>
+      <w:pPr>
+        <w:ind w:left="3600" w:hanging="360"/>
+      </w:pPr>
+      <w:rPr>
+        <w:rFonts w:ascii="Symbol" w:hAnsi="Symbol" w:hint="default"/>
+      </w:rPr>
+    </w:lvl>
+    <w:lvl w:ilvl="4" w:tplc="04090003" w:tentative="1">
+      <w:start w:val="1"/>
+      <w:numFmt w:val="bullet"/>
+      <w:lvlText w:val="o"/>
+      <w:lvlJc w:val="left"/>
+      <w:pPr>
+        <w:ind w:left="4320" w:hanging="360"/>
+      </w:pPr>
+      <w:rPr>
+        <w:rFonts w:ascii="Courier New" w:hAnsi="Courier New" w:cs="Courier New" w:hint="default"/>
+      </w:rPr>
+    </w:lvl>
+    <w:lvl w:ilvl="5" w:tplc="04090005" w:tentative="1">
+      <w:start w:val="1"/>
+      <w:numFmt w:val="bullet"/>
+      <w:lvlText w:val=""/>
+      <w:lvlJc w:val="left"/>
+      <w:pPr>
+        <w:ind w:left="5040" w:hanging="360"/>
+      </w:pPr>
+      <w:rPr>
+        <w:rFonts w:ascii="Wingdings" w:hAnsi="Wingdings" w:hint="default"/>
+      </w:rPr>
+    </w:lvl>
+    <w:lvl w:ilvl="6" w:tplc="04090001" w:tentative="1">
+      <w:start w:val="1"/>
+      <w:numFmt w:val="bullet"/>
+      <w:lvlText w:val=""/>
+      <w:lvlJc w:val="left"/>
+      <w:pPr>
+        <w:ind w:left="5760" w:hanging="360"/>
+      </w:pPr>
+      <w:rPr>
+        <w:rFonts w:ascii="Symbol" w:hAnsi="Symbol" w:hint="default"/>
+      </w:rPr>
+    </w:lvl>
+    <w:lvl w:ilvl="7" w:tplc="04090003" w:tentative="1">
+      <w:start w:val="1"/>
+      <w:numFmt w:val="bullet"/>
+      <w:lvlText w:val="o"/>
+      <w:lvlJc w:val="left"/>
+      <w:pPr>
+        <w:ind w:left="6480" w:hanging="360"/>
+      </w:pPr>
+      <w:rPr>
+        <w:rFonts w:ascii="Courier New" w:hAnsi="Courier New" w:cs="Courier New" w:hint="default"/>
+      </w:rPr>
+    </w:lvl>
+    <w:lvl w:ilvl="8" w:tplc="04090005" w:tentative="1">
+      <w:start w:val="1"/>
+      <w:numFmt w:val="bullet"/>
+      <w:lvlText w:val=""/>
+      <w:lvlJc w:val="left"/>
+      <w:pPr>
+        <w:ind w:left="7200" w:hanging="360"/>
+      </w:pPr>
+      <w:rPr>
+        <w:rFonts w:ascii="Wingdings" w:hAnsi="Wingdings" w:hint="default"/>
+      </w:rPr>
+    </w:lvl>
+  </w:abstractNum>
+  <w:abstractNum w:abstractNumId="20" w15:restartNumberingAfterBreak="0">
+    <w:nsid w:val="655D5C93"/>
+    <w:multiLevelType w:val="hybridMultilevel"/>
+    <w:tmpl w:val="8A508202"/>
+    <w:lvl w:ilvl="0" w:tplc="394EDC3C">
+      <w:start w:val="1"/>
+      <w:numFmt w:val="bullet"/>
+      <w:lvlText w:val=""/>
+      <w:lvlJc w:val="center"/>
+      <w:pPr>
+        <w:ind w:left="1080" w:hanging="360"/>
+      </w:pPr>
+      <w:rPr>
+        <w:rFonts w:ascii="Symbol" w:hAnsi="Symbol" w:hint="default"/>
+      </w:rPr>
+    </w:lvl>
+    <w:lvl w:ilvl="1" w:tplc="4168AE56">
+      <w:start w:val="1"/>
+      <w:numFmt w:val="bullet"/>
+      <w:lvlText w:val=""/>
+      <w:lvlJc w:val="left"/>
+      <w:pPr>
+        <w:ind w:left="1800" w:hanging="360"/>
+      </w:pPr>
+      <w:rPr>
+        <w:rFonts w:ascii="Symbol" w:hAnsi="Symbol" w:hint="default"/>
+      </w:rPr>
+    </w:lvl>
+    <w:lvl w:ilvl="2" w:tplc="04090005">
+      <w:start w:val="1"/>
+      <w:numFmt w:val="bullet"/>
+      <w:lvlText w:val=""/>
+      <w:lvlJc w:val="left"/>
+      <w:pPr>
+        <w:ind w:left="2520" w:hanging="360"/>
+      </w:pPr>
+      <w:rPr>
+        <w:rFonts w:ascii="Wingdings" w:hAnsi="Wingdings" w:hint="default"/>
+      </w:rPr>
+    </w:lvl>
+    <w:lvl w:ilvl="3" w:tplc="04090001" w:tentative="1">
+      <w:start w:val="1"/>
+      <w:numFmt w:val="bullet"/>
+      <w:lvlText w:val=""/>
+      <w:lvlJc w:val="left"/>
+      <w:pPr>
+        <w:ind w:left="3240" w:hanging="360"/>
+      </w:pPr>
+      <w:rPr>
+        <w:rFonts w:ascii="Symbol" w:hAnsi="Symbol" w:hint="default"/>
+      </w:rPr>
+    </w:lvl>
+    <w:lvl w:ilvl="4" w:tplc="04090003" w:tentative="1">
+      <w:start w:val="1"/>
+      <w:numFmt w:val="bullet"/>
+      <w:lvlText w:val="o"/>
+      <w:lvlJc w:val="left"/>
+      <w:pPr>
+        <w:ind w:left="3960" w:hanging="360"/>
+      </w:pPr>
+      <w:rPr>
+        <w:rFonts w:ascii="Courier New" w:hAnsi="Courier New" w:cs="Courier New" w:hint="default"/>
+      </w:rPr>
+    </w:lvl>
+    <w:lvl w:ilvl="5" w:tplc="04090005" w:tentative="1">
+      <w:start w:val="1"/>
+      <w:numFmt w:val="bullet"/>
+      <w:lvlText w:val=""/>
+      <w:lvlJc w:val="left"/>
+      <w:pPr>
+        <w:ind w:left="4680" w:hanging="360"/>
+      </w:pPr>
+      <w:rPr>
+        <w:rFonts w:ascii="Wingdings" w:hAnsi="Wingdings" w:hint="default"/>
+      </w:rPr>
+    </w:lvl>
+    <w:lvl w:ilvl="6" w:tplc="04090001" w:tentative="1">
+      <w:start w:val="1"/>
+      <w:numFmt w:val="bullet"/>
+      <w:lvlText w:val=""/>
+      <w:lvlJc w:val="left"/>
+      <w:pPr>
+        <w:ind w:left="5400" w:hanging="360"/>
+      </w:pPr>
+      <w:rPr>
+        <w:rFonts w:ascii="Symbol" w:hAnsi="Symbol" w:hint="default"/>
+      </w:rPr>
+    </w:lvl>
+    <w:lvl w:ilvl="7" w:tplc="04090003" w:tentative="1">
+      <w:start w:val="1"/>
+      <w:numFmt w:val="bullet"/>
+      <w:lvlText w:val="o"/>
+      <w:lvlJc w:val="left"/>
+      <w:pPr>
+        <w:ind w:left="6120" w:hanging="360"/>
+      </w:pPr>
+      <w:rPr>
+        <w:rFonts w:ascii="Courier New" w:hAnsi="Courier New" w:cs="Courier New" w:hint="default"/>
+      </w:rPr>
+    </w:lvl>
+    <w:lvl w:ilvl="8" w:tplc="04090005" w:tentative="1">
+      <w:start w:val="1"/>
+      <w:numFmt w:val="bullet"/>
+      <w:lvlText w:val=""/>
+      <w:lvlJc w:val="left"/>
+      <w:pPr>
+        <w:ind w:left="6840" w:hanging="360"/>
+      </w:pPr>
+      <w:rPr>
+        <w:rFonts w:ascii="Wingdings" w:hAnsi="Wingdings" w:hint="default"/>
+      </w:rPr>
+    </w:lvl>
+  </w:abstractNum>
+  <w:abstractNum w:abstractNumId="21" w15:restartNumberingAfterBreak="0">
     <w:nsid w:val="664646E2"/>
     <w:multiLevelType w:val="hybridMultilevel"/>
     <w:tmpl w:val="E288027E"/>
@@ -10832,7 +11694,119 @@
       </w:pPr>
     </w:lvl>
   </w:abstractNum>
-  <w:abstractNum w:abstractNumId="19" w15:restartNumberingAfterBreak="0">
+  <w:abstractNum w:abstractNumId="22" w15:restartNumberingAfterBreak="0">
+    <w:nsid w:val="6ABE4E6B"/>
+    <w:multiLevelType w:val="hybridMultilevel"/>
+    <w:tmpl w:val="C1929978"/>
+    <w:lvl w:ilvl="0" w:tplc="1542DD70">
+      <w:numFmt w:val="bullet"/>
+      <w:lvlText w:val="-"/>
+      <w:lvlJc w:val="left"/>
+      <w:pPr>
+        <w:ind w:left="720" w:hanging="360"/>
+      </w:pPr>
+      <w:rPr>
+        <w:rFonts w:ascii="Times New Roman" w:eastAsiaTheme="minorHAnsi" w:hAnsi="Times New Roman" w:cs="Times New Roman" w:hint="default"/>
+      </w:rPr>
+    </w:lvl>
+    <w:lvl w:ilvl="1" w:tplc="04090003">
+      <w:start w:val="1"/>
+      <w:numFmt w:val="bullet"/>
+      <w:lvlText w:val="o"/>
+      <w:lvlJc w:val="left"/>
+      <w:pPr>
+        <w:ind w:left="1440" w:hanging="360"/>
+      </w:pPr>
+      <w:rPr>
+        <w:rFonts w:ascii="Courier New" w:hAnsi="Courier New" w:cs="Courier New" w:hint="default"/>
+      </w:rPr>
+    </w:lvl>
+    <w:lvl w:ilvl="2" w:tplc="04090005" w:tentative="1">
+      <w:start w:val="1"/>
+      <w:numFmt w:val="bullet"/>
+      <w:lvlText w:val=""/>
+      <w:lvlJc w:val="left"/>
+      <w:pPr>
+        <w:ind w:left="2160" w:hanging="360"/>
+      </w:pPr>
+      <w:rPr>
+        <w:rFonts w:ascii="Wingdings" w:hAnsi="Wingdings" w:hint="default"/>
+      </w:rPr>
+    </w:lvl>
+    <w:lvl w:ilvl="3" w:tplc="04090001" w:tentative="1">
+      <w:start w:val="1"/>
+      <w:numFmt w:val="bullet"/>
+      <w:lvlText w:val=""/>
+      <w:lvlJc w:val="left"/>
+      <w:pPr>
+        <w:ind w:left="2880" w:hanging="360"/>
+      </w:pPr>
+      <w:rPr>
+        <w:rFonts w:ascii="Symbol" w:hAnsi="Symbol" w:hint="default"/>
+      </w:rPr>
+    </w:lvl>
+    <w:lvl w:ilvl="4" w:tplc="04090003" w:tentative="1">
+      <w:start w:val="1"/>
+      <w:numFmt w:val="bullet"/>
+      <w:lvlText w:val="o"/>
+      <w:lvlJc w:val="left"/>
+      <w:pPr>
+        <w:ind w:left="3600" w:hanging="360"/>
+      </w:pPr>
+      <w:rPr>
+        <w:rFonts w:ascii="Courier New" w:hAnsi="Courier New" w:cs="Courier New" w:hint="default"/>
+      </w:rPr>
+    </w:lvl>
+    <w:lvl w:ilvl="5" w:tplc="04090005" w:tentative="1">
+      <w:start w:val="1"/>
+      <w:numFmt w:val="bullet"/>
+      <w:lvlText w:val=""/>
+      <w:lvlJc w:val="left"/>
+      <w:pPr>
+        <w:ind w:left="4320" w:hanging="360"/>
+      </w:pPr>
+      <w:rPr>
+        <w:rFonts w:ascii="Wingdings" w:hAnsi="Wingdings" w:hint="default"/>
+      </w:rPr>
+    </w:lvl>
+    <w:lvl w:ilvl="6" w:tplc="04090001" w:tentative="1">
+      <w:start w:val="1"/>
+      <w:numFmt w:val="bullet"/>
+      <w:lvlText w:val=""/>
+      <w:lvlJc w:val="left"/>
+      <w:pPr>
+        <w:ind w:left="5040" w:hanging="360"/>
+      </w:pPr>
+      <w:rPr>
+        <w:rFonts w:ascii="Symbol" w:hAnsi="Symbol" w:hint="default"/>
+      </w:rPr>
+    </w:lvl>
+    <w:lvl w:ilvl="7" w:tplc="04090003" w:tentative="1">
+      <w:start w:val="1"/>
+      <w:numFmt w:val="bullet"/>
+      <w:lvlText w:val="o"/>
+      <w:lvlJc w:val="left"/>
+      <w:pPr>
+        <w:ind w:left="5760" w:hanging="360"/>
+      </w:pPr>
+      <w:rPr>
+        <w:rFonts w:ascii="Courier New" w:hAnsi="Courier New" w:cs="Courier New" w:hint="default"/>
+      </w:rPr>
+    </w:lvl>
+    <w:lvl w:ilvl="8" w:tplc="04090005" w:tentative="1">
+      <w:start w:val="1"/>
+      <w:numFmt w:val="bullet"/>
+      <w:lvlText w:val=""/>
+      <w:lvlJc w:val="left"/>
+      <w:pPr>
+        <w:ind w:left="6480" w:hanging="360"/>
+      </w:pPr>
+      <w:rPr>
+        <w:rFonts w:ascii="Wingdings" w:hAnsi="Wingdings" w:hint="default"/>
+      </w:rPr>
+    </w:lvl>
+  </w:abstractNum>
+  <w:abstractNum w:abstractNumId="23" w15:restartNumberingAfterBreak="0">
     <w:nsid w:val="6B810E6A"/>
     <w:multiLevelType w:val="hybridMultilevel"/>
     <w:tmpl w:val="4A88DC34"/>
@@ -10945,7 +11919,7 @@
       </w:rPr>
     </w:lvl>
   </w:abstractNum>
-  <w:abstractNum w:abstractNumId="20" w15:restartNumberingAfterBreak="0">
+  <w:abstractNum w:abstractNumId="24" w15:restartNumberingAfterBreak="0">
     <w:nsid w:val="71604BA4"/>
     <w:multiLevelType w:val="hybridMultilevel"/>
     <w:tmpl w:val="4D1A56B6"/>
@@ -11058,7 +12032,7 @@
       </w:rPr>
     </w:lvl>
   </w:abstractNum>
-  <w:abstractNum w:abstractNumId="21" w15:restartNumberingAfterBreak="0">
+  <w:abstractNum w:abstractNumId="25" w15:restartNumberingAfterBreak="0">
     <w:nsid w:val="74DF6D80"/>
     <w:multiLevelType w:val="hybridMultilevel"/>
     <w:tmpl w:val="1AC079E8"/>
@@ -11149,7 +12123,7 @@
       </w:pPr>
     </w:lvl>
   </w:abstractNum>
-  <w:abstractNum w:abstractNumId="22" w15:restartNumberingAfterBreak="0">
+  <w:abstractNum w:abstractNumId="26" w15:restartNumberingAfterBreak="0">
     <w:nsid w:val="78900F63"/>
     <w:multiLevelType w:val="hybridMultilevel"/>
     <w:tmpl w:val="AB52E8F6"/>
@@ -11262,7 +12236,7 @@
       </w:rPr>
     </w:lvl>
   </w:abstractNum>
-  <w:abstractNum w:abstractNumId="23" w15:restartNumberingAfterBreak="0">
+  <w:abstractNum w:abstractNumId="27" w15:restartNumberingAfterBreak="0">
     <w:nsid w:val="79BF5A33"/>
     <w:multiLevelType w:val="hybridMultilevel"/>
     <w:tmpl w:val="F466ABF6"/>
@@ -11351,7 +12325,7 @@
       </w:pPr>
     </w:lvl>
   </w:abstractNum>
-  <w:abstractNum w:abstractNumId="24" w15:restartNumberingAfterBreak="0">
+  <w:abstractNum w:abstractNumId="28" w15:restartNumberingAfterBreak="0">
     <w:nsid w:val="7CDB395B"/>
     <w:multiLevelType w:val="hybridMultilevel"/>
     <w:tmpl w:val="EAE86480"/>
@@ -11465,40 +12439,40 @@
     </w:lvl>
   </w:abstractNum>
   <w:num w:numId="1" w16cid:durableId="350884850">
-    <w:abstractNumId w:val="23"/>
+    <w:abstractNumId w:val="27"/>
   </w:num>
   <w:num w:numId="2" w16cid:durableId="1043478131">
     <w:abstractNumId w:val="8"/>
   </w:num>
   <w:num w:numId="3" w16cid:durableId="1185749737">
-    <w:abstractNumId w:val="16"/>
+    <w:abstractNumId w:val="17"/>
   </w:num>
   <w:num w:numId="4" w16cid:durableId="963776825">
-    <w:abstractNumId w:val="18"/>
+    <w:abstractNumId w:val="21"/>
   </w:num>
   <w:num w:numId="5" w16cid:durableId="872424141">
-    <w:abstractNumId w:val="14"/>
+    <w:abstractNumId w:val="15"/>
   </w:num>
   <w:num w:numId="6" w16cid:durableId="1549294638">
     <w:abstractNumId w:val="4"/>
   </w:num>
   <w:num w:numId="7" w16cid:durableId="2070423983">
-    <w:abstractNumId w:val="17"/>
+    <w:abstractNumId w:val="18"/>
   </w:num>
   <w:num w:numId="8" w16cid:durableId="470639295">
-    <w:abstractNumId w:val="21"/>
+    <w:abstractNumId w:val="25"/>
   </w:num>
   <w:num w:numId="9" w16cid:durableId="681392705">
     <w:abstractNumId w:val="1"/>
   </w:num>
   <w:num w:numId="10" w16cid:durableId="126167635">
-    <w:abstractNumId w:val="24"/>
+    <w:abstractNumId w:val="28"/>
   </w:num>
   <w:num w:numId="11" w16cid:durableId="832376439">
     <w:abstractNumId w:val="5"/>
   </w:num>
   <w:num w:numId="12" w16cid:durableId="1749958965">
-    <w:abstractNumId w:val="13"/>
+    <w:abstractNumId w:val="14"/>
   </w:num>
   <w:num w:numId="13" w16cid:durableId="469397028">
     <w:abstractNumId w:val="10"/>
@@ -11510,10 +12484,10 @@
     <w:abstractNumId w:val="6"/>
   </w:num>
   <w:num w:numId="16" w16cid:durableId="946157434">
-    <w:abstractNumId w:val="20"/>
+    <w:abstractNumId w:val="24"/>
   </w:num>
   <w:num w:numId="17" w16cid:durableId="1799108256">
-    <w:abstractNumId w:val="22"/>
+    <w:abstractNumId w:val="26"/>
   </w:num>
   <w:num w:numId="18" w16cid:durableId="426659532">
     <w:abstractNumId w:val="11"/>
@@ -11525,7 +12499,7 @@
     <w:abstractNumId w:val="2"/>
   </w:num>
   <w:num w:numId="21" w16cid:durableId="2022506827">
-    <w:abstractNumId w:val="15"/>
+    <w:abstractNumId w:val="16"/>
   </w:num>
   <w:num w:numId="22" w16cid:durableId="410855309">
     <w:abstractNumId w:val="0"/>
@@ -11534,10 +12508,22 @@
     <w:abstractNumId w:val="3"/>
   </w:num>
   <w:num w:numId="24" w16cid:durableId="1365910142">
-    <w:abstractNumId w:val="19"/>
+    <w:abstractNumId w:val="23"/>
   </w:num>
   <w:num w:numId="25" w16cid:durableId="42213318">
     <w:abstractNumId w:val="9"/>
+  </w:num>
+  <w:num w:numId="26" w16cid:durableId="357775218">
+    <w:abstractNumId w:val="13"/>
+  </w:num>
+  <w:num w:numId="27" w16cid:durableId="1276332289">
+    <w:abstractNumId w:val="20"/>
+  </w:num>
+  <w:num w:numId="28" w16cid:durableId="2057662280">
+    <w:abstractNumId w:val="19"/>
+  </w:num>
+  <w:num w:numId="29" w16cid:durableId="1934894442">
+    <w:abstractNumId w:val="22"/>
   </w:num>
 </w:numbering>
 </file>

</xml_diff>